<commit_message>
Release simulator UI and workflow v0.1.1
</commit_message>
<xml_diff>
--- a/docs/EyalEspressoServerSimulatorDetailedDesign.docx
+++ b/docs/EyalEspressoServerSimulatorDetailedDesign.docx
@@ -20,17 +20,32 @@
     </w:p>
     <w:p>
       <w:r>
-        <w:t>Application Entry: FastAPI app entry point starts API routes and coordinates simulator services.</w:t>
+        <w:t>Implementation Language: the simulator application codebase is currently Python-only.</w:t>
       </w:r>
     </w:p>
     <w:p>
       <w:r>
-        <w:t>Transport Layer: One serial manager owns the COM device and handles framing and TX or RX state.</w:t>
+        <w:t>Application Entry: server/app.py is the FastAPI app entry point and coordinates API route registration plus simulator service startup.</w:t>
       </w:r>
     </w:p>
     <w:p>
       <w:r>
-        <w:t>Simulation Layer: Controller state machine simulates machine state, responses, telemetry, and faults.</w:t>
+        <w:t>API Layer: server/api/routes.py exposes operator and test endpoints for machine commands, status, and telemetry views.</w:t>
+      </w:r>
+    </w:p>
+    <w:p>
+      <w:r>
+        <w:t>Transport Layer: server/transport/serial_link.py owns the serial COM device, framing, and TX/RX state so request handlers do not compete for the same port.</w:t>
+      </w:r>
+    </w:p>
+    <w:p>
+      <w:r>
+        <w:t>Simulation Layer: server/sim/controller_state.py simulates machine state, controller responses, telemetry, and fault behavior.</w:t>
+      </w:r>
+    </w:p>
+    <w:p>
+      <w:r>
+        <w:t>Package Layout: the runtime code is split under server/api, server/transport, and server/sim, with tests kept separately under tests.</w:t>
       </w:r>
     </w:p>
     <w:p/>
@@ -41,7 +56,12 @@
     </w:p>
     <w:p>
       <w:r>
-        <w:t>FastAPI shall expose operator and test endpoints for machine commands and telemetry.</w:t>
+        <w:t>Primary Interface: FastAPI exposes REST endpoints for operator and test control of the simulated backend.</w:t>
+      </w:r>
+    </w:p>
+    <w:p>
+      <w:r>
+        <w:t>Transport Interface: a single background serial manager is responsible for all COM-port ownership and exchange with the ESP32 client side.</w:t>
       </w:r>
     </w:p>
     <w:p/>
@@ -55,6 +75,11 @@
         <w:t>Versioning, protocol constants, and simulator defaults shall be kept under repository control.</w:t>
       </w:r>
     </w:p>
+    <w:p>
+      <w:r>
+        <w:t>Repository Documents: requirements, detailed design, revision history, and versioning notes are maintained under docs.</w:t>
+      </w:r>
+    </w:p>
     <w:p/>
     <w:p>
       <w:r>
@@ -63,7 +88,12 @@
     </w:p>
     <w:p>
       <w:r>
-        <w:t>Recommended environment: Python, FastAPI, pyserial, uvicorn, and local tests executed from the repository root.</w:t>
+        <w:t>Runtime Stack: Python, FastAPI, pyserial, and uvicorn.</w:t>
+      </w:r>
+    </w:p>
+    <w:p>
+      <w:r>
+        <w:t>Execution Model: the simulator runs as a Python backend service from the repository root, with tests and helper scripts kept alongside the application code.</w:t>
       </w:r>
     </w:p>
     <w:sectPr>

</xml_diff>

<commit_message>
Update simulator detailed design run instructions
</commit_message>
<xml_diff>
--- a/docs/EyalEspressoServerSimulatorDetailedDesign.docx
+++ b/docs/EyalEspressoServerSimulatorDetailedDesign.docx
@@ -9,7 +9,7 @@
     </w:p>
     <w:p>
       <w:r>
-        <w:t>Project Version Reference: 0.1.0</w:t>
+        <w:t>Project Version Reference: 0.1.1</w:t>
       </w:r>
     </w:p>
     <w:p/>
@@ -96,6 +96,26 @@
         <w:t>Execution Model: the simulator runs as a Python backend service from the repository root, with tests and helper scripts kept alongside the application code.</w:t>
       </w:r>
     </w:p>
+    <w:p>
+      <w:r>
+        <w:t>Local Environment Setup: create a local virtual environment with python -m venv .venv and install dependencies with .\.venv\Scripts\python.exe -m pip install -r requirements.txt pytest.</w:t>
+      </w:r>
+    </w:p>
+    <w:p>
+      <w:r>
+        <w:t>Local Run Command: start the simulator from the repository root with ./scripts/run_simulator.ps1.</w:t>
+      </w:r>
+    </w:p>
+    <w:p>
+      <w:r>
+        <w:t>Live Reload Command: use ./scripts/run_simulator.ps1 -Reload during active UI and backend development.</w:t>
+      </w:r>
+    </w:p>
+    <w:p>
+      <w:r>
+        <w:t>Default Access URL: after startup, open http://127.0.0.1:8000 in a browser to use the simulator UI.</w:t>
+      </w:r>
+    </w:p>
     <w:sectPr>
       <w:pgSz w:w="12240" w:h="15840"/>
       <w:pgMar w:top="1440" w:right="1440" w:bottom="1440" w:left="1440" w:header="708" w:footer="708" w:gutter="0"/>

</xml_diff>

<commit_message>
Mirror client Wi-Fi transport model in simulator
</commit_message>
<xml_diff>
--- a/docs/EyalEspressoServerSimulatorDetailedDesign.docx
+++ b/docs/EyalEspressoServerSimulatorDetailedDesign.docx
@@ -14,7 +14,7 @@
     </w:p>
     <w:p>
       <w:r>
-        <w:t xml:space="preserve">Project Version Reference: 0.1.1</w:t>
+        <w:t xml:space="preserve">Project Version Reference: 0.1.3</w:t>
       </w:r>
     </w:p>
     <w:p>
@@ -396,6 +396,67 @@
     <w:p/>
     <w:p>
       <w:r>
+        <w:t xml:space="preserve">3.1 Mirrored Runtime Configuration Defaults</w:t>
+      </w:r>
+    </w:p>
+    <w:p>
+      <w:r>
+        <w:t xml:space="preserve">The simulator host shall mirror the same low-level transport defaults used by the client-side communication layer so both repositories describe one coherent interface contract.</w:t>
+      </w:r>
+    </w:p>
+    <w:p>
+      <w:r>
+        <w:t xml:space="preserve">Default Fields:</w:t>
+      </w:r>
+    </w:p>
+    <w:p>
+      <w:r>
+        <w:t xml:space="preserve">  serial_port = COM4</w:t>
+      </w:r>
+    </w:p>
+    <w:p>
+      <w:r>
+        <w:t xml:space="preserve">  wifi_ssid = EyalSimulatorAP</w:t>
+      </w:r>
+    </w:p>
+    <w:p>
+      <w:r>
+        <w:t xml:space="preserve">  wifi_password = espresso1234</w:t>
+      </w:r>
+    </w:p>
+    <w:p>
+      <w:r>
+        <w:t xml:space="preserve">  server_ip = 192.168.4.1</w:t>
+      </w:r>
+    </w:p>
+    <w:p>
+      <w:r>
+        <w:t xml:space="preserve">  server_port = 3333</w:t>
+      </w:r>
+    </w:p>
+    <w:p>
+      <w:r>
+        <w:t xml:space="preserve">  wifi_connect_timeout_ms = 10000</w:t>
+      </w:r>
+    </w:p>
+    <w:p>
+      <w:r>
+        <w:t xml:space="preserve">  tcp_connect_timeout_ms = 3000</w:t>
+      </w:r>
+    </w:p>
+    <w:p>
+      <w:r>
+        <w:t xml:space="preserve">  keepalive_period_ms = 100</w:t>
+      </w:r>
+    </w:p>
+    <w:p>
+      <w:r>
+        <w:t xml:space="preserve">Simulator Rule: the PC host stores and displays this mirrored configuration even though the ESP32-C3 bridge remains the actual owner of the physical Wi-Fi/TCP link.</w:t>
+      </w:r>
+    </w:p>
+    <w:p/>
+    <w:p>
+      <w:r>
         <w:t xml:space="preserve">4. Standard Low-Level Frame Envelope</w:t>
       </w:r>
     </w:p>
@@ -618,7 +679,12 @@
     </w:p>
     <w:p>
       <w:r>
-        <w:t xml:space="preserve">  PC Host -&gt; INITIALIZE(wifi role, tcp role, target, watchdog settings)</w:t>
+        <w:t xml:space="preserve">  PC Host -&gt; INITIALIZE(serial port, Wi-Fi SSID/password, server IP/port, watchdog settings)</w:t>
+      </w:r>
+    </w:p>
+    <w:p>
+      <w:r>
+        <w:t xml:space="preserve">  Simulator host -&gt; validate mirrored COM and Wi-Fi/TCP configuration</w:t>
       </w:r>
     </w:p>
     <w:p>
@@ -698,12 +764,12 @@
     </w:p>
     <w:p>
       <w:r>
-        <w:t xml:space="preserve">  PC Host -&gt; CONNECT</w:t>
-      </w:r>
-    </w:p>
-    <w:p>
-      <w:r>
-        <w:t xml:space="preserve">  ESP32-C3 -&gt; establish Wi-Fi and TCP session</w:t>
+        <w:t xml:space="preserve">  PC Host -&gt; CONNECT(server endpoint reference)</w:t>
+      </w:r>
+    </w:p>
+    <w:p>
+      <w:r>
+        <w:t xml:space="preserve">  ESP32-C3 -&gt; establish Wi-Fi-ready state and attempt TCP session</w:t>
       </w:r>
     </w:p>
     <w:p>
@@ -1327,6 +1393,42 @@
     <w:p/>
     <w:p>
       <w:r>
+        <w:t xml:space="preserve">8.4A COM Port Not Found</w:t>
+      </w:r>
+    </w:p>
+    <w:p>
+      <w:r>
+        <w:t xml:space="preserve">Description: the simulator host cannot open the configured COM port while preparing the bridge session.</w:t>
+      </w:r>
+    </w:p>
+    <w:p>
+      <w:r>
+        <w:t xml:space="preserve">Simulator Error Text: COM port not found.</w:t>
+      </w:r>
+    </w:p>
+    <w:p>
+      <w:r>
+        <w:t xml:space="preserve">Diagram:</w:t>
+      </w:r>
+    </w:p>
+    <w:p>
+      <w:r>
+        <w:t xml:space="preserve">  open or initialize -&gt; COM port unavailable -&gt; error</w:t>
+      </w:r>
+    </w:p>
+    <w:p>
+      <w:r>
+        <w:t xml:space="preserve">Recovery:</w:t>
+      </w:r>
+    </w:p>
+    <w:p>
+      <w:r>
+        <w:t xml:space="preserve">  error -&gt; restore COM availability -&gt; reset</w:t>
+      </w:r>
+    </w:p>
+    <w:p/>
+    <w:p>
+      <w:r>
         <w:t xml:space="preserve">8.5 Wi-Fi Association Failure</w:t>
       </w:r>
     </w:p>
@@ -1358,6 +1460,114 @@
     <w:p/>
     <w:p>
       <w:r>
+        <w:t xml:space="preserve">8.5A Configured AP Offline or Not Visible</w:t>
+      </w:r>
+    </w:p>
+    <w:p>
+      <w:r>
+        <w:t xml:space="preserve">Description: the mirrored Wi-Fi configuration indicates an unavailable AP or bridge-side validation reports that the target AP is not visible.</w:t>
+      </w:r>
+    </w:p>
+    <w:p>
+      <w:r>
+        <w:t xml:space="preserve">Simulator Error Text: Wi-Fi AP is offline.</w:t>
+      </w:r>
+    </w:p>
+    <w:p>
+      <w:r>
+        <w:t xml:space="preserve">Diagram:</w:t>
+      </w:r>
+    </w:p>
+    <w:p>
+      <w:r>
+        <w:t xml:space="preserve">  initialize -&gt; validate mirrored Wi-Fi config -&gt; AP unavailable -&gt; error</w:t>
+      </w:r>
+    </w:p>
+    <w:p>
+      <w:r>
+        <w:t xml:space="preserve">Recovery:</w:t>
+      </w:r>
+    </w:p>
+    <w:p>
+      <w:r>
+        <w:t xml:space="preserve">  error -&gt; correct RF environment or Wi-Fi configuration -&gt; reset -&gt; initialize</w:t>
+      </w:r>
+    </w:p>
+    <w:p/>
+    <w:p>
+      <w:r>
+        <w:t xml:space="preserve">8.5B TCP Server Not Found or Not Listening</w:t>
+      </w:r>
+    </w:p>
+    <w:p>
+      <w:r>
+        <w:t xml:space="preserve">Description: the bridge-side connect path cannot reach the configured server endpoint as an active listener.</w:t>
+      </w:r>
+    </w:p>
+    <w:p>
+      <w:r>
+        <w:t xml:space="preserve">Simulator Error Text: TCP server not found.</w:t>
+      </w:r>
+    </w:p>
+    <w:p>
+      <w:r>
+        <w:t xml:space="preserve">Diagram:</w:t>
+      </w:r>
+    </w:p>
+    <w:p>
+      <w:r>
+        <w:t xml:space="preserve">  connect -&gt; TCP listener unavailable -&gt; error</w:t>
+      </w:r>
+    </w:p>
+    <w:p>
+      <w:r>
+        <w:t xml:space="preserve">Recovery:</w:t>
+      </w:r>
+    </w:p>
+    <w:p>
+      <w:r>
+        <w:t xml:space="preserve">  error -&gt; restore listener or correct endpoint -&gt; initialize -&gt; connect</w:t>
+      </w:r>
+    </w:p>
+    <w:p/>
+    <w:p>
+      <w:r>
+        <w:t xml:space="preserve">8.5C Generic Unknown Transport Failure</w:t>
+      </w:r>
+    </w:p>
+    <w:p>
+      <w:r>
+        <w:t xml:space="preserve">Description: a transport stage fails without enough evidence to classify the fault as COM, Wi-Fi AP, or TCP listener specific.</w:t>
+      </w:r>
+    </w:p>
+    <w:p>
+      <w:r>
+        <w:t xml:space="preserve">Simulator Error Text: generic unknown failure.</w:t>
+      </w:r>
+    </w:p>
+    <w:p>
+      <w:r>
+        <w:t xml:space="preserve">Diagram:</w:t>
+      </w:r>
+    </w:p>
+    <w:p>
+      <w:r>
+        <w:t xml:space="preserve">  initialize/connect -&gt; stage-specific failure without precise classification -&gt; error</w:t>
+      </w:r>
+    </w:p>
+    <w:p>
+      <w:r>
+        <w:t xml:space="preserve">Recovery:</w:t>
+      </w:r>
+    </w:p>
+    <w:p>
+      <w:r>
+        <w:t xml:space="preserve">  error -&gt; review stage detail -&gt; reset or initialize</w:t>
+      </w:r>
+    </w:p>
+    <w:p/>
+    <w:p>
+      <w:r>
         <w:t xml:space="preserve">8.6 TCP Session Loss</w:t>
       </w:r>
     </w:p>
@@ -1477,6 +1687,11 @@
     <w:p>
       <w:r>
         <w:t xml:space="preserve">  server/sim/controller_state.py = simulator-side state and telemetry model</w:t>
+      </w:r>
+    </w:p>
+    <w:p>
+      <w:r>
+        <w:t xml:space="preserve">  server/sim/link_state_machine.py = mirrored low-level COM + Wi-Fi/TCP state model and error mapping</w:t>
       </w:r>
     </w:p>
     <w:p>

</xml_diff>

<commit_message>
Release simulator UI and logger refinements v0.1.4
</commit_message>
<xml_diff>
--- a/docs/EyalEspressoServerSimulatorDetailedDesign.docx
+++ b/docs/EyalEspressoServerSimulatorDetailedDesign.docx
@@ -1738,7 +1738,63 @@
     <w:p/>
     <w:p>
       <w:r>
-        <w:t xml:space="preserve">11. Notes</w:t>
+        <w:t xml:space="preserve">11. Simulator UI State and Command Feedback</w:t>
+      </w:r>
+    </w:p>
+    <w:p>
+      <w:r>
+        <w:t xml:space="preserve">Command Button Rule: simulator command buttons use blue as the default unpressed color.</w:t>
+      </w:r>
+    </w:p>
+    <w:p>
+      <w:r>
+        <w:t xml:space="preserve">Pressed/In-Progress Rule: when a command button is pressed it turns gray and looks pressed while the related command or state transition is still in progress.</w:t>
+      </w:r>
+    </w:p>
+    <w:p>
+      <w:r>
+        <w:t xml:space="preserve">Completion Rule: after the related state/action finishes, the command button returns to the default blue unpressed state.</w:t>
+      </w:r>
+    </w:p>
+    <w:p>
+      <w:r>
+        <w:t xml:space="preserve">Machine State Color Rules:</w:t>
+      </w:r>
+    </w:p>
+    <w:p>
+      <w:r>
+        <w:t xml:space="preserve">  dark blue = inactive / default after reset</w:t>
+      </w:r>
+    </w:p>
+    <w:p>
+      <w:r>
+        <w:t xml:space="preserve">  blinking green = in progress</w:t>
+      </w:r>
+    </w:p>
+    <w:p>
+      <w:r>
+        <w:t xml:space="preserve">  red = finished with failure</w:t>
+      </w:r>
+    </w:p>
+    <w:p>
+      <w:r>
+        <w:t xml:space="preserve">  light green = finished with success</w:t>
+      </w:r>
+    </w:p>
+    <w:p>
+      <w:r>
+        <w:t xml:space="preserve">Grouping Rule: machine-state indication shall be shown in a dedicated titled group box named Machine State so state reporting remains visually separate from operator commands.</w:t>
+      </w:r>
+    </w:p>
+    <w:p>
+      <w:r>
+        <w:t xml:space="preserve">Logger Rule: the logger remains a separate rolling history surface and is not itself a machine-state indicator.</w:t>
+      </w:r>
+    </w:p>
+    <w:p/>
+    <w:p>
+      <w:r>
+        <w:t xml:space="preserve">12. Notes</w:t>
       </w:r>
     </w:p>
     <w:p>

</xml_diff>

<commit_message>
docs: define simulator backend launch contract
</commit_message>
<xml_diff>
--- a/docs/EyalEspressoServerSimulatorDetailedDesign.docx
+++ b/docs/EyalEspressoServerSimulatorDetailedDesign.docx
@@ -14,7 +14,12 @@
     </w:p>
     <w:p>
       <w:r>
-        <w:t xml:space="preserve">Project Version Reference: 0.1.3</w:t>
+        <w:t xml:space="preserve">Project Version Reference: 0.1.4</w:t>
+      </w:r>
+    </w:p>
+    <w:p>
+      <w:r>
+        <w:t xml:space="preserve">Reviewed on: 11-Mar-26 11:48:02</w:t>
       </w:r>
     </w:p>
     <w:p>
@@ -1735,6 +1740,81 @@
         <w:t xml:space="preserve">Default Access URL: http://127.0.0.1:8000</w:t>
       </w:r>
     </w:p>
+    <w:p>
+      <w:r>
+        <w:t xml:space="preserve">Backend Launch Design:</w:t>
+      </w:r>
+    </w:p>
+    <w:p>
+      <w:r>
+        <w:t xml:space="preserve">  - use a deterministic repo-local launcher script or service wrapper</w:t>
+      </w:r>
+    </w:p>
+    <w:p>
+      <w:r>
+        <w:t xml:space="preserve">  - prefer the repository virtual environment interpreter before a global Python installation</w:t>
+      </w:r>
+    </w:p>
+    <w:p>
+      <w:r>
+        <w:t xml:space="preserve">  - capture stdout and stderr to logs or keep them visible in the supervising console</w:t>
+      </w:r>
+    </w:p>
+    <w:p>
+      <w:r>
+        <w:t xml:space="preserve">  - require a concrete readiness signal such as GET /health before opening the UI</w:t>
+      </w:r>
+    </w:p>
+    <w:p>
+      <w:r>
+        <w:t xml:space="preserve">  - supervise the process with a stable host if it must outlive the initiating shell</w:t>
+      </w:r>
+    </w:p>
+    <w:p>
+      <w:r>
+        <w:t xml:space="preserve">  - separate application correctness from editor, sandbox, or task-runner lifetime</w:t>
+      </w:r>
+    </w:p>
+    <w:p>
+      <w:r>
+        <w:t xml:space="preserve">Preferred Uvicorn Launch Contract:</w:t>
+      </w:r>
+    </w:p>
+    <w:p>
+      <w:r>
+        <w:t xml:space="preserve">  - launch scripts/run_simulator.ps1 from the repository root</w:t>
+      </w:r>
+    </w:p>
+    <w:p>
+      <w:r>
+        <w:t xml:space="preserve">  - let the script resolve .\.venv\Scripts\python.exe when available</w:t>
+      </w:r>
+    </w:p>
+    <w:p>
+      <w:r>
+        <w:t xml:space="preserve">  - start uvicorn as server.app:app on 127.0.0.1:8000</w:t>
+      </w:r>
+    </w:p>
+    <w:p>
+      <w:r>
+        <w:t xml:space="preserve">  - verify readiness with GET /health expecting 200 OK and {"status":"ok"}</w:t>
+      </w:r>
+    </w:p>
+    <w:p>
+      <w:r>
+        <w:t xml:space="preserve">  - open the browser only after readiness succeeds</w:t>
+      </w:r>
+    </w:p>
+    <w:p>
+      <w:r>
+        <w:t xml:space="preserve">  - bypass stale browser state with a cache-busting query string when opening the UI</w:t>
+      </w:r>
+    </w:p>
+    <w:p>
+      <w:r>
+        <w:t xml:space="preserve">Operational Note: if a foreground uvicorn launch works but a detached tool-hosted launch dies immediately, classify the problem as process-hosting automation first, not as a backend application defect.</w:t>
+      </w:r>
+    </w:p>
     <w:p/>
     <w:p>
       <w:r>

</xml_diff>

<commit_message>
docs: add simulator batch launcher
</commit_message>
<xml_diff>
--- a/docs/EyalEspressoServerSimulatorDetailedDesign.docx
+++ b/docs/EyalEspressoServerSimulatorDetailedDesign.docx
@@ -14,12 +14,12 @@
     </w:p>
     <w:p>
       <w:r>
-        <w:t xml:space="preserve">Project Version Reference: 0.1.4</w:t>
-      </w:r>
-    </w:p>
-    <w:p>
-      <w:r>
-        <w:t xml:space="preserve">Reviewed on: 11-Mar-26 11:48:02</w:t>
+        <w:t xml:space="preserve">Project Version Reference: 0.1.5</w:t>
+      </w:r>
+    </w:p>
+    <w:p>
+      <w:r>
+        <w:t xml:space="preserve">Reviewed on: 11-Mar-26 11:55:29</w:t>
       </w:r>
     </w:p>
     <w:p>
@@ -1815,6 +1815,76 @@
         <w:t xml:space="preserve">Operational Note: if a foreground uvicorn launch works but a detached tool-hosted launch dies immediately, classify the problem as process-hosting automation first, not as a backend application defect.</w:t>
       </w:r>
     </w:p>
+    <w:p>
+      <w:r>
+        <w:t xml:space="preserve">Helper Script Inventory:</w:t>
+      </w:r>
+    </w:p>
+    <w:p>
+      <w:r>
+        <w:t xml:space="preserve">  - scripts/run_simulator.ps1 = primary repo-local simulator launcher that resolves the repository root, prefers the local .venv interpreter, and starts uvicorn</w:t>
+      </w:r>
+    </w:p>
+    <w:p>
+      <w:r>
+        <w:t xml:space="preserve">  - scripts/run_simulator.bat = Windows batch wrapper that forwards arguments into scripts/run_simulator.ps1 with execution-policy bypass</w:t>
+      </w:r>
+    </w:p>
+    <w:p>
+      <w:r>
+        <w:t xml:space="preserve">  - scripts/setup_idf_env.ps1 = prepares the local ESP-IDF shell environment for firmware-side commands</w:t>
+      </w:r>
+    </w:p>
+    <w:p>
+      <w:r>
+        <w:t xml:space="preserve">  - scripts/idfw.ps1 = PowerShell helper that forwards ESP-IDF commands through the local environment activation flow</w:t>
+      </w:r>
+    </w:p>
+    <w:p>
+      <w:r>
+        <w:t xml:space="preserve">  - scripts/idfw.cmd = cmd wrapper for the ESP-IDF PowerShell launcher so Windows shells can invoke firmware workflows consistently</w:t>
+      </w:r>
+    </w:p>
+    <w:p>
+      <w:r>
+        <w:t xml:space="preserve">  - scripts/monitor_capture.ps1 = fallback serial capture helper that reads the target port without reset for bounded log collection</w:t>
+      </w:r>
+    </w:p>
+    <w:p>
+      <w:r>
+        <w:t xml:space="preserve">  - scripts/play_build_success_sound.ps1 = one-shot celebration sound helper for successful verification cycles</w:t>
+      </w:r>
+    </w:p>
+    <w:p>
+      <w:r>
+        <w:t xml:space="preserve">  - scripts/play_wait_sound.ps1 = one-shot wait-notification playback helper</w:t>
+      </w:r>
+    </w:p>
+    <w:p>
+      <w:r>
+        <w:t xml:space="preserve">  - scripts/start_wait_sound.ps1 = starts the repeating wait-sound worker and records its process handle</w:t>
+      </w:r>
+    </w:p>
+    <w:p>
+      <w:r>
+        <w:t xml:space="preserve">  - scripts/stop_wait_sound.ps1 = stops the repeating wait-sound worker using the recorded handle</w:t>
+      </w:r>
+    </w:p>
+    <w:p>
+      <w:r>
+        <w:t xml:space="preserve">  - scripts/generate_requirements_docx.ps1 = generates the requirements-and-design .docx artifact from repo-local OpenXML content</w:t>
+      </w:r>
+    </w:p>
+    <w:p>
+      <w:r>
+        <w:t xml:space="preserve">  - scripts/generate_detailed_design_docx.ps1 = generates this detailed design .docx artifact and embeds the maintained diagram images</w:t>
+      </w:r>
+    </w:p>
+    <w:p>
+      <w:r>
+        <w:t xml:space="preserve">  - scripts/generate_transport_diagrams.ps1 = renders the maintained transport architecture diagrams used by the design set</w:t>
+      </w:r>
+    </w:p>
     <w:p/>
     <w:p>
       <w:r>

</xml_diff>

<commit_message>
feat: reset simulator listeners on launch
</commit_message>
<xml_diff>
--- a/docs/EyalEspressoServerSimulatorDetailedDesign.docx
+++ b/docs/EyalEspressoServerSimulatorDetailedDesign.docx
@@ -14,12 +14,12 @@
     </w:p>
     <w:p>
       <w:r>
-        <w:t xml:space="preserve">Project Version Reference: 0.1.5</w:t>
-      </w:r>
-    </w:p>
-    <w:p>
-      <w:r>
-        <w:t xml:space="preserve">Reviewed on: 11-Mar-26 11:55:29</w:t>
+        <w:t xml:space="preserve">Project Version Reference: 0.1.6</w:t>
+      </w:r>
+    </w:p>
+    <w:p>
+      <w:r>
+        <w:t xml:space="preserve">Reviewed on: 11-Mar-26 12:05:37</w:t>
       </w:r>
     </w:p>
     <w:p>
@@ -1757,6 +1757,11 @@
     </w:p>
     <w:p>
       <w:r>
+        <w:t xml:space="preserve">  - before launching uvicorn, automatically stop any existing listener already bound to the requested simulator port</w:t>
+      </w:r>
+    </w:p>
+    <w:p>
+      <w:r>
         <w:t xml:space="preserve">  - capture stdout and stderr to logs or keep them visible in the supervising console</w:t>
       </w:r>
     </w:p>
@@ -1792,6 +1797,11 @@
     </w:p>
     <w:p>
       <w:r>
+        <w:t xml:space="preserve">  - stop any pre-existing process that is listening on the requested simulator port so only one backend instance remains authoritative</w:t>
+      </w:r>
+    </w:p>
+    <w:p>
+      <w:r>
         <w:t xml:space="preserve">  - start uvicorn as server.app:app on 127.0.0.1:8000</w:t>
       </w:r>
     </w:p>
@@ -1822,12 +1832,12 @@
     </w:p>
     <w:p>
       <w:r>
-        <w:t xml:space="preserve">  - scripts/run_simulator.ps1 = primary repo-local simulator launcher that resolves the repository root, prefers the local .venv interpreter, and starts uvicorn</w:t>
-      </w:r>
-    </w:p>
-    <w:p>
-      <w:r>
-        <w:t xml:space="preserve">  - scripts/run_simulator.bat = Windows batch wrapper that forwards arguments into scripts/run_simulator.ps1 with execution-policy bypass</w:t>
+        <w:t xml:space="preserve">  - scripts/run_simulator.ps1 = primary repo-local simulator launcher that resolves the repository root, prefers the local .venv interpreter, stops stale listeners on the target port, and starts uvicorn</w:t>
+      </w:r>
+    </w:p>
+    <w:p>
+      <w:r>
+        <w:t xml:space="preserve">  - scripts/run_simulator.bat = Windows batch wrapper that forwards arguments into scripts/run_simulator.ps1 with execution-policy bypass and inherits the same stale-listener cleanup</w:t>
       </w:r>
     </w:p>
     <w:p>

</xml_diff>

<commit_message>
docs: tighten simulator listener replacement safety
</commit_message>
<xml_diff>
--- a/docs/EyalEspressoServerSimulatorDetailedDesign.docx
+++ b/docs/EyalEspressoServerSimulatorDetailedDesign.docx
@@ -19,7 +19,7 @@
     </w:p>
     <w:p>
       <w:r>
-        <w:t xml:space="preserve">Reviewed on: 11-Mar-26 12:05:37</w:t>
+        <w:t xml:space="preserve">Reviewed on: 11-Mar-26 12:09:51</w:t>
       </w:r>
     </w:p>
     <w:p>
@@ -1757,7 +1757,12 @@
     </w:p>
     <w:p>
       <w:r>
-        <w:t xml:space="preserve">  - before launching uvicorn, automatically stop any existing listener already bound to the requested simulator port</w:t>
+        <w:t xml:space="preserve">  - before launching uvicorn, inspect any existing listener already bound to the requested simulator port and only replace it when it is positively identified as this simulator backend</w:t>
+      </w:r>
+    </w:p>
+    <w:p>
+      <w:r>
+        <w:t xml:space="preserve">  - prefer graceful shutdown before forced termination when replacing an existing simulator listener</w:t>
       </w:r>
     </w:p>
     <w:p>
@@ -1797,7 +1802,17 @@
     </w:p>
     <w:p>
       <w:r>
-        <w:t xml:space="preserve">  - stop any pre-existing process that is listening on the requested simulator port so only one backend instance remains authoritative</w:t>
+        <w:t xml:space="preserve">  - stop a pre-existing process only when the launcher can verify from process metadata and command line that the listener belongs to this simulator backend</w:t>
+      </w:r>
+    </w:p>
+    <w:p>
+      <w:r>
+        <w:t xml:space="preserve">  - refuse startup rather than kill an unrelated service that happens to own the target port</w:t>
+      </w:r>
+    </w:p>
+    <w:p>
+      <w:r>
+        <w:t xml:space="preserve">  - attempt normal process termination first, then force-stop only if the old simulator backend does not exit in time</w:t>
       </w:r>
     </w:p>
     <w:p>
@@ -1832,12 +1847,12 @@
     </w:p>
     <w:p>
       <w:r>
-        <w:t xml:space="preserve">  - scripts/run_simulator.ps1 = primary repo-local simulator launcher that resolves the repository root, prefers the local .venv interpreter, stops stale listeners on the target port, and starts uvicorn</w:t>
-      </w:r>
-    </w:p>
-    <w:p>
-      <w:r>
-        <w:t xml:space="preserve">  - scripts/run_simulator.bat = Windows batch wrapper that forwards arguments into scripts/run_simulator.ps1 with execution-policy bypass and inherits the same stale-listener cleanup</w:t>
+        <w:t xml:space="preserve">  - scripts/run_simulator.ps1 = primary repo-local simulator launcher that resolves the repository root, prefers the local .venv interpreter, safely replaces only verified stale simulator listeners on the target port, and starts uvicorn</w:t>
+      </w:r>
+    </w:p>
+    <w:p>
+      <w:r>
+        <w:t xml:space="preserve">  - scripts/run_simulator.bat = Windows batch wrapper that forwards arguments into scripts/run_simulator.ps1 with execution-policy bypass and inherits the same verified-listener replacement behavior</w:t>
       </w:r>
     </w:p>
     <w:p>

</xml_diff>

<commit_message>
feat: prompt to open simulator browser after startup
</commit_message>
<xml_diff>
--- a/docs/EyalEspressoServerSimulatorDetailedDesign.docx
+++ b/docs/EyalEspressoServerSimulatorDetailedDesign.docx
@@ -19,7 +19,7 @@
     </w:p>
     <w:p>
       <w:r>
-        <w:t xml:space="preserve">Reviewed on: 11-Mar-26 12:09:51</w:t>
+        <w:t xml:space="preserve">Reviewed on: 11-Mar-26 12:16:26</w:t>
       </w:r>
     </w:p>
     <w:p>
@@ -1832,6 +1832,11 @@
     </w:p>
     <w:p>
       <w:r>
+        <w:t xml:space="preserve">  - for the manual batch launcher, show a Yes/No prompt after backend readiness asking whether to open the simulator in a fresh browser session with a cache-busting URL</w:t>
+      </w:r>
+    </w:p>
+    <w:p>
+      <w:r>
         <w:t xml:space="preserve">  - bypass stale browser state with a cache-busting query string when opening the UI</w:t>
       </w:r>
     </w:p>
@@ -1852,7 +1857,12 @@
     </w:p>
     <w:p>
       <w:r>
-        <w:t xml:space="preserve">  - scripts/run_simulator.bat = Windows batch wrapper that forwards arguments into scripts/run_simulator.ps1 with execution-policy bypass and inherits the same verified-listener replacement behavior</w:t>
+        <w:t xml:space="preserve">  - scripts/launch_simulator_ui.ps1 = manual-launch helper that starts the backend host, waits for /health, and shows a browser-open confirmation message box</w:t>
+      </w:r>
+    </w:p>
+    <w:p>
+      <w:r>
+        <w:t xml:space="preserve">  - scripts/run_simulator.bat = Windows batch wrapper that forwards arguments into scripts/launch_simulator_ui.ps1 with execution-policy bypass</w:t>
       </w:r>
     </w:p>
     <w:p>

</xml_diff>

<commit_message>
feat: verify simulator installation before manual launch
</commit_message>
<xml_diff>
--- a/docs/EyalEspressoServerSimulatorDetailedDesign.docx
+++ b/docs/EyalEspressoServerSimulatorDetailedDesign.docx
@@ -19,7 +19,7 @@
     </w:p>
     <w:p>
       <w:r>
-        <w:t xml:space="preserve">Reviewed on: 11-Mar-26 12:16:26</w:t>
+        <w:t xml:space="preserve">Reviewed on: 11-Mar-26 12:22:13</w:t>
       </w:r>
     </w:p>
     <w:p>
@@ -1742,6 +1742,31 @@
     </w:p>
     <w:p>
       <w:r>
+        <w:t xml:space="preserve">Installation Verification Design:</w:t>
+      </w:r>
+    </w:p>
+    <w:p>
+      <w:r>
+        <w:t xml:space="preserve">  - the manual batch launcher shall verify the required local runtime components before it attempts any simulator startup script</w:t>
+      </w:r>
+    </w:p>
+    <w:p>
+      <w:r>
+        <w:t xml:space="preserve">  - the required development-baseline runtime is Python 3.13.3 with fastapi 0.135.1, uvicorn 0.41.0, and pyserial 3.5 in the repository-local .venv</w:t>
+      </w:r>
+    </w:p>
+    <w:p>
+      <w:r>
+        <w:t xml:space="preserve">  - if any required component is missing or its version differs from the development baseline, show a popup listing the gaps and stop the launch</w:t>
+      </w:r>
+    </w:p>
+    <w:p>
+      <w:r>
+        <w:t xml:space="preserve">  - do not continue into backend startup when installation verification fails</w:t>
+      </w:r>
+    </w:p>
+    <w:p>
+      <w:r>
         <w:t xml:space="preserve">Backend Launch Design:</w:t>
       </w:r>
     </w:p>
@@ -1853,6 +1878,11 @@
     <w:p>
       <w:r>
         <w:t xml:space="preserve">  - scripts/run_simulator.ps1 = primary repo-local simulator launcher that resolves the repository root, prefers the local .venv interpreter, safely replaces only verified stale simulator listeners on the target port, and starts uvicorn</w:t>
+      </w:r>
+    </w:p>
+    <w:p>
+      <w:r>
+        <w:t xml:space="preserve">  - scripts/verify_simulator_installation.ps1 = manual-launch preflight check that verifies required runtime components and exact development versions before startup</w:t>
       </w:r>
     </w:p>
     <w:p>

</xml_diff>

<commit_message>
docs: add installation and repair design chapter
</commit_message>
<xml_diff>
--- a/docs/EyalEspressoServerSimulatorDetailedDesign.docx
+++ b/docs/EyalEspressoServerSimulatorDetailedDesign.docx
@@ -19,7 +19,7 @@
     </w:p>
     <w:p>
       <w:r>
-        <w:t xml:space="preserve">Reviewed on: 11-Mar-26 12:22:13</w:t>
+        <w:t xml:space="preserve">Reviewed on: 11-Mar-26 12:38:18</w:t>
       </w:r>
     </w:p>
     <w:p>
@@ -1742,6 +1742,36 @@
     </w:p>
     <w:p>
       <w:r>
+        <w:t xml:space="preserve">Runtime Version Baseline:</w:t>
+      </w:r>
+    </w:p>
+    <w:p>
+      <w:r>
+        <w:t xml:space="preserve">  - Python = 3.13.3</w:t>
+      </w:r>
+    </w:p>
+    <w:p>
+      <w:r>
+        <w:t xml:space="preserve">  - fastapi = 0.135.1</w:t>
+      </w:r>
+    </w:p>
+    <w:p>
+      <w:r>
+        <w:t xml:space="preserve">  - uvicorn = 0.41.0</w:t>
+      </w:r>
+    </w:p>
+    <w:p>
+      <w:r>
+        <w:t xml:space="preserve">  - pyserial = 3.5</w:t>
+      </w:r>
+    </w:p>
+    <w:p>
+      <w:r>
+        <w:t xml:space="preserve">Versioning Rule: these runtime versions define the local development baseline for the manual simulator launcher and installation verification flow.</w:t>
+      </w:r>
+    </w:p>
+    <w:p>
+      <w:r>
         <w:t xml:space="preserve">Installation Verification Design:</w:t>
       </w:r>
     </w:p>
@@ -1752,7 +1782,7 @@
     </w:p>
     <w:p>
       <w:r>
-        <w:t xml:space="preserve">  - the required development-baseline runtime is Python 3.13.3 with fastapi 0.135.1, uvicorn 0.41.0, and pyserial 3.5 in the repository-local .venv</w:t>
+        <w:t xml:space="preserve">  - the required development-baseline runtime shall match the Runtime Version Baseline listed in this section using the repository-local .venv</w:t>
       </w:r>
     </w:p>
     <w:p>
@@ -1953,7 +1983,213 @@
     <w:p/>
     <w:p>
       <w:r>
-        <w:t xml:space="preserve">11. Simulator UI State and Command Feedback</w:t>
+        <w:t xml:space="preserve">11. Installation and Rapair Design</w:t>
+      </w:r>
+    </w:p>
+    <w:p>
+      <w:r>
+        <w:t xml:space="preserve">Purpose: this chapter defines how future installer and repair flows shall create, verify, and restore the simulator runtime environment so local setups remain aligned with the development baseline.</w:t>
+      </w:r>
+    </w:p>
+    <w:p>
+      <w:r>
+        <w:t xml:space="preserve">Best-Practice Installation Rules:</w:t>
+      </w:r>
+    </w:p>
+    <w:p>
+      <w:r>
+        <w:t xml:space="preserve">  - treat the repository .venv as disposable and reproducible rather than as a permanent hand-maintained asset</w:t>
+      </w:r>
+    </w:p>
+    <w:p>
+      <w:r>
+        <w:t xml:space="preserve">  - create the virtual environment from the intended Python version explicitly instead of relying on whatever python happens to be on PATH</w:t>
+      </w:r>
+    </w:p>
+    <w:p>
+      <w:r>
+        <w:t xml:space="preserve">  - install packages through the repository-local interpreter or its pip entry point so installation always targets the correct .venv</w:t>
+      </w:r>
+    </w:p>
+    <w:p>
+      <w:r>
+        <w:t xml:space="preserve">  - pin exact dependency versions with == for repeatable installs</w:t>
+      </w:r>
+    </w:p>
+    <w:p>
+      <w:r>
+        <w:t xml:space="preserve">  - prefer stronger reproducibility with hashes for tightly controlled or release-oriented installer flows</w:t>
+      </w:r>
+    </w:p>
+    <w:p>
+      <w:r>
+        <w:t xml:space="preserve">  - treat the .venv as non-portable and recreate it when the environment is moved, damaged, or version-drifted</w:t>
+      </w:r>
+    </w:p>
+    <w:p>
+      <w:r>
+        <w:t xml:space="preserve">  - run verification after install instead of assuming installation success implies runtime correctness</w:t>
+      </w:r>
+    </w:p>
+    <w:p>
+      <w:r>
+        <w:t xml:space="preserve">Development Alignment Rules:</w:t>
+      </w:r>
+    </w:p>
+    <w:p>
+      <w:r>
+        <w:t xml:space="preserve">  - the installer shall compare the local runtime against the documented Runtime Version Baseline</w:t>
+      </w:r>
+    </w:p>
+    <w:p>
+      <w:r>
+        <w:t xml:space="preserve">  - alignment checks shall include the Python version and the exact package versions required by the simulator</w:t>
+      </w:r>
+    </w:p>
+    <w:p>
+      <w:r>
+        <w:t xml:space="preserve">  - the launcher or installer shall fail fast when versions drift or required components are missing</w:t>
+      </w:r>
+    </w:p>
+    <w:p>
+      <w:r>
+        <w:t xml:space="preserve">  - any failure report shall list concrete gaps so the operator knows exactly what is missing or mismatched</w:t>
+      </w:r>
+    </w:p>
+    <w:p>
+      <w:r>
+        <w:t xml:space="preserve">Verification Scope for Installer and Repair:</w:t>
+      </w:r>
+    </w:p>
+    <w:p>
+      <w:r>
+        <w:t xml:space="preserve">  - verify the repository-local Python interpreter exists</w:t>
+      </w:r>
+    </w:p>
+    <w:p>
+      <w:r>
+        <w:t xml:space="preserve">  - verify the Python version matches the development baseline exactly</w:t>
+      </w:r>
+    </w:p>
+    <w:p>
+      <w:r>
+        <w:t xml:space="preserve">  - verify each required runtime package is installed</w:t>
+      </w:r>
+    </w:p>
+    <w:p>
+      <w:r>
+        <w:t xml:space="preserve">  - verify each required runtime package version matches the development baseline exactly</w:t>
+      </w:r>
+    </w:p>
+    <w:p>
+      <w:r>
+        <w:t xml:space="preserve">  - verify the environment is not carrying stale or partially uninstalled distribution artifacts</w:t>
+      </w:r>
+    </w:p>
+    <w:p>
+      <w:r>
+        <w:t xml:space="preserve">  - run package-health validation after installation or repair</w:t>
+      </w:r>
+    </w:p>
+    <w:p>
+      <w:r>
+        <w:t xml:space="preserve">Preferred Repair Philosophy:</w:t>
+      </w:r>
+    </w:p>
+    <w:p>
+      <w:r>
+        <w:t xml:space="preserve">  - a damaged or drifted .venv should normally be rebuilt, not patched manually</w:t>
+      </w:r>
+    </w:p>
+    <w:p>
+      <w:r>
+        <w:t xml:space="preserve">  - the safest repair path is remove -&gt; recreate -&gt; reinstall -&gt; reverify</w:t>
+      </w:r>
+    </w:p>
+    <w:p>
+      <w:r>
+        <w:t xml:space="preserve">  - surgical package repair may be used only for clearly isolated minor issues, but full rebuild remains the default reliable method</w:t>
+      </w:r>
+    </w:p>
+    <w:p>
+      <w:r>
+        <w:t xml:space="preserve">Repair Flow Design:</w:t>
+      </w:r>
+    </w:p>
+    <w:p>
+      <w:r>
+        <w:t xml:space="preserve">  1. detect a missing component, version mismatch, or broken package artifact</w:t>
+      </w:r>
+    </w:p>
+    <w:p>
+      <w:r>
+        <w:t xml:space="preserve">  2. present the gap list clearly to the operator</w:t>
+      </w:r>
+    </w:p>
+    <w:p>
+      <w:r>
+        <w:t xml:space="preserve">  3. offer a Repair action instead of requiring manual reconstruction</w:t>
+      </w:r>
+    </w:p>
+    <w:p>
+      <w:r>
+        <w:t xml:space="preserve">  4. delete the repository .venv</w:t>
+      </w:r>
+    </w:p>
+    <w:p>
+      <w:r>
+        <w:t xml:space="preserve">  5. recreate the .venv using the required Python version</w:t>
+      </w:r>
+    </w:p>
+    <w:p>
+      <w:r>
+        <w:t xml:space="preserve">  6. reinstall the pinned baseline dependencies</w:t>
+      </w:r>
+    </w:p>
+    <w:p>
+      <w:r>
+        <w:t xml:space="preserve">  7. rerun verification</w:t>
+      </w:r>
+    </w:p>
+    <w:p>
+      <w:r>
+        <w:t xml:space="preserve">  8. report success or failure with a clear popup summary</w:t>
+      </w:r>
+    </w:p>
+    <w:p>
+      <w:r>
+        <w:t xml:space="preserve">Installer Integration Expectation:</w:t>
+      </w:r>
+    </w:p>
+    <w:p>
+      <w:r>
+        <w:t xml:space="preserve">  - when a future installer is implemented, it shall read the version-baseline and verification requirements from this chapter and use them as the source of truth for setup and repair behavior</w:t>
+      </w:r>
+    </w:p>
+    <w:p>
+      <w:r>
+        <w:t xml:space="preserve">Why This Design Is Preferred:</w:t>
+      </w:r>
+    </w:p>
+    <w:p>
+      <w:r>
+        <w:t xml:space="preserve">  - rebuilding the environment is usually more reliable than trying to patch a partially corrupted venv</w:t>
+      </w:r>
+    </w:p>
+    <w:p>
+      <w:r>
+        <w:t xml:space="preserve">  - explicit verification makes local runtime drift visible before the simulator launch fails later</w:t>
+      </w:r>
+    </w:p>
+    <w:p>
+      <w:r>
+        <w:t xml:space="preserve">  - one-step repair keeps the workflow practical for operator test stations and development machines</w:t>
+      </w:r>
+    </w:p>
+    <w:p/>
+    <w:p>
+      <w:r>
+        <w:t xml:space="preserve">12. Simulator UI State and Command Feedback</w:t>
       </w:r>
     </w:p>
     <w:p>
@@ -2009,7 +2245,7 @@
     <w:p/>
     <w:p>
       <w:r>
-        <w:t xml:space="preserve">12. Notes</w:t>
+        <w:t xml:space="preserve">13. Notes</w:t>
       </w:r>
     </w:p>
     <w:p>

</xml_diff>

<commit_message>
feat: add firmware version tree and splash metadata
</commit_message>
<xml_diff>
--- a/docs/EyalEspressoServerSimulatorDetailedDesign.docx
+++ b/docs/EyalEspressoServerSimulatorDetailedDesign.docx
@@ -19,7 +19,7 @@
     </w:p>
     <w:p>
       <w:r>
-        <w:t xml:space="preserve">Reviewed on: 11-Mar-26 12:38:18</w:t>
+        <w:t xml:space="preserve">Reviewed on: 11-Mar-26 13:12:05</w:t>
       </w:r>
     </w:p>
     <w:p>
@@ -1742,6 +1742,26 @@
     </w:p>
     <w:p>
       <w:r>
+        <w:t xml:space="preserve">Repository Version Tree:</w:t>
+      </w:r>
+    </w:p>
+    <w:p>
+      <w:r>
+        <w:t xml:space="preserve">  - Application Version = 0.1.6 from repository root VERSION</w:t>
+      </w:r>
+    </w:p>
+    <w:p>
+      <w:r>
+        <w:t xml:space="preserve">  - Firmware Version = 0.1.0 from firmware/esp32c3_bridge/VERSION</w:t>
+      </w:r>
+    </w:p>
+    <w:p>
+      <w:r>
+        <w:t xml:space="preserve">Version Tree Rule: application and firmware versions use the same X.Y.Z policy but remain independently tracked artifacts inside one repository version tree.</w:t>
+      </w:r>
+    </w:p>
+    <w:p>
+      <w:r>
         <w:t xml:space="preserve">Runtime Version Baseline:</w:t>
       </w:r>
     </w:p>
@@ -1888,6 +1908,11 @@
     <w:p>
       <w:r>
         <w:t xml:space="preserve">  - for the manual batch launcher, show a Yes/No prompt after backend readiness asking whether to open the simulator in a fresh browser session with a cache-busting URL</w:t>
+      </w:r>
+    </w:p>
+    <w:p>
+      <w:r>
+        <w:t xml:space="preserve">  - the startup splash screen shall show the application name, simulator application version, bridge firmware version, and backend build timestamp for 5 seconds</w:t>
       </w:r>
     </w:p>
     <w:p>

</xml_diff>

<commit_message>
fix: collapse simulator launcher to one host
</commit_message>
<xml_diff>
--- a/docs/EyalEspressoServerSimulatorDetailedDesign.docx
+++ b/docs/EyalEspressoServerSimulatorDetailedDesign.docx
@@ -19,7 +19,7 @@
     </w:p>
     <w:p>
       <w:r>
-        <w:t xml:space="preserve">Reviewed on: 11-Mar-26 13:12:05</w:t>
+        <w:t xml:space="preserve">Reviewed on: 11-Mar-26 13:22:29</w:t>
       </w:r>
     </w:p>
     <w:p>
@@ -1797,7 +1797,7 @@
     </w:p>
     <w:p>
       <w:r>
-        <w:t xml:space="preserve">  - the manual batch launcher shall verify the required local runtime components before it attempts any simulator startup script</w:t>
+        <w:t xml:space="preserve">  - the manual launcher shall verify the required local runtime components inside the single visible launcher host before it attempts any simulator startup step</w:t>
       </w:r>
     </w:p>
     <w:p>
@@ -1867,7 +1867,17 @@
     </w:p>
     <w:p>
       <w:r>
-        <w:t xml:space="preserve">  - launch scripts/run_simulator.ps1 from the repository root</w:t>
+        <w:t xml:space="preserve">  - scripts/run_simulator.bat shall open one visible PowerShell host for the standard-user launch path</w:t>
+      </w:r>
+    </w:p>
+    <w:p>
+      <w:r>
+        <w:t xml:space="preserve">  - scripts/launch_simulator_ui.ps1 shall own installation verification, backend readiness waiting, and the browser-open prompt inside that same launcher host</w:t>
+      </w:r>
+    </w:p>
+    <w:p>
+      <w:r>
+        <w:t xml:space="preserve">  - launch scripts/run_simulator.ps1 from the repository root for backend-only startup logic</w:t>
       </w:r>
     </w:p>
     <w:p>
@@ -1892,6 +1902,11 @@
     </w:p>
     <w:p>
       <w:r>
+        <w:t xml:space="preserve">  - the manual launcher shall start the backend as a Python process directly rather than opening a second visible PowerShell host</w:t>
+      </w:r>
+    </w:p>
+    <w:p>
+      <w:r>
         <w:t xml:space="preserve">  - start uvicorn as server.app:app on 127.0.0.1:8000</w:t>
       </w:r>
     </w:p>
@@ -1937,17 +1952,17 @@
     </w:p>
     <w:p>
       <w:r>
-        <w:t xml:space="preserve">  - scripts/verify_simulator_installation.ps1 = manual-launch preflight check that verifies required runtime components and exact development versions before startup</w:t>
-      </w:r>
-    </w:p>
-    <w:p>
-      <w:r>
-        <w:t xml:space="preserve">  - scripts/launch_simulator_ui.ps1 = manual-launch helper that starts the backend host, waits for /health, and shows a browser-open confirmation message box</w:t>
-      </w:r>
-    </w:p>
-    <w:p>
-      <w:r>
-        <w:t xml:space="preserve">  - scripts/run_simulator.bat = Windows batch wrapper that forwards arguments into scripts/launch_simulator_ui.ps1 with execution-policy bypass</w:t>
+        <w:t xml:space="preserve">  - scripts/verify_simulator_installation.ps1 = shared manual-launch preflight check that verifies required runtime components and exact development versions</w:t>
+      </w:r>
+    </w:p>
+    <w:p>
+      <w:r>
+        <w:t xml:space="preserve">  - scripts/launch_simulator_ui.ps1 = single-host manual-launch helper that verifies installation, starts the backend process, waits for /health, and shows a browser-open confirmation message box</w:t>
+      </w:r>
+    </w:p>
+    <w:p>
+      <w:r>
+        <w:t xml:space="preserve">  - scripts/run_simulator.bat = Windows batch wrapper that opens the one visible PowerShell host for scripts/launch_simulator_ui.ps1</w:t>
       </w:r>
     </w:p>
     <w:p>

</xml_diff>

<commit_message>
fix: remove extra launcher console
</commit_message>
<xml_diff>
--- a/docs/EyalEspressoServerSimulatorDetailedDesign.docx
+++ b/docs/EyalEspressoServerSimulatorDetailedDesign.docx
@@ -19,7 +19,7 @@
     </w:p>
     <w:p>
       <w:r>
-        <w:t xml:space="preserve">Reviewed on: 11-Mar-26 13:22:29</w:t>
+        <w:t xml:space="preserve">Reviewed on: 11-Mar-26 13:37:14</w:t>
       </w:r>
     </w:p>
     <w:p>
@@ -1867,7 +1867,7 @@
     </w:p>
     <w:p>
       <w:r>
-        <w:t xml:space="preserve">  - scripts/run_simulator.bat shall open one visible PowerShell host for the standard-user launch path</w:t>
+        <w:t xml:space="preserve">  - scripts/run_simulator.bat shall hand off directly into one visible PowerShell session for the standard-user launch path</w:t>
       </w:r>
     </w:p>
     <w:p>
@@ -1962,7 +1962,7 @@
     </w:p>
     <w:p>
       <w:r>
-        <w:t xml:space="preserve">  - scripts/run_simulator.bat = Windows batch wrapper that opens the one visible PowerShell host for scripts/launch_simulator_ui.ps1</w:t>
+        <w:t xml:space="preserve">  - scripts/run_simulator.bat = Windows batch wrapper that hands off directly into the one visible PowerShell session for scripts/launch_simulator_ui.ps1</w:t>
       </w:r>
     </w:p>
     <w:p>

</xml_diff>

<commit_message>
fix: close launcher shell after startup
</commit_message>
<xml_diff>
--- a/docs/EyalEspressoServerSimulatorDetailedDesign.docx
+++ b/docs/EyalEspressoServerSimulatorDetailedDesign.docx
@@ -19,7 +19,7 @@
     </w:p>
     <w:p>
       <w:r>
-        <w:t xml:space="preserve">Reviewed on: 11-Mar-26 13:37:14</w:t>
+        <w:t xml:space="preserve">Reviewed on: 11-Mar-26 13:40:30</w:t>
       </w:r>
     </w:p>
     <w:p>
@@ -1867,7 +1867,7 @@
     </w:p>
     <w:p>
       <w:r>
-        <w:t xml:space="preserve">  - scripts/run_simulator.bat shall hand off directly into one visible PowerShell session for the standard-user launch path</w:t>
+        <w:t xml:space="preserve">  - scripts/run_simulator.bat shall open one temporary PowerShell session for the standard-user launch path and close it after backend readiness and the browser prompt complete</w:t>
       </w:r>
     </w:p>
     <w:p>
@@ -1962,7 +1962,7 @@
     </w:p>
     <w:p>
       <w:r>
-        <w:t xml:space="preserve">  - scripts/run_simulator.bat = Windows batch wrapper that hands off directly into the one visible PowerShell session for scripts/launch_simulator_ui.ps1</w:t>
+        <w:t xml:space="preserve">  - scripts/run_simulator.bat = Windows batch wrapper that opens a temporary PowerShell session for scripts/launch_simulator_ui.ps1 and closes it after the prompt flow completes</w:t>
       </w:r>
     </w:p>
     <w:p>

</xml_diff>

<commit_message>
release: bump simulator version to 0.1.10
</commit_message>
<xml_diff>
--- a/docs/EyalEspressoServerSimulatorDetailedDesign.docx
+++ b/docs/EyalEspressoServerSimulatorDetailedDesign.docx
@@ -14,12 +14,12 @@
     </w:p>
     <w:p>
       <w:r>
-        <w:t xml:space="preserve">Project Version Reference: 0.1.6</w:t>
-      </w:r>
-    </w:p>
-    <w:p>
-      <w:r>
-        <w:t xml:space="preserve">Reviewed on: 11-Mar-26 13:40:30</w:t>
+        <w:t xml:space="preserve">Project Version Reference: 0.1.9</w:t>
+      </w:r>
+    </w:p>
+    <w:p>
+      <w:r>
+        <w:t xml:space="preserve">Reviewed on: 11-Mar-26 15:55:25</w:t>
       </w:r>
     </w:p>
     <w:p>
@@ -180,7 +180,7 @@
     </w:p>
     <w:p>
       <w:r>
-        <w:t xml:space="preserve">  - maintain the low-level state machine: reset, initialize, connect, disconnect, error</w:t>
+        <w:t xml:space="preserve">  - maintain the low-level state machine: reset, initialize, connect, keepalive/send-data supervision, error</w:t>
       </w:r>
     </w:p>
     <w:p>
@@ -211,6 +211,278 @@
     <w:p/>
     <w:p>
       <w:r>
+        <w:t xml:space="preserve">2.4 Current Implemented Split: PC Simulator Runtime</w:t>
+      </w:r>
+    </w:p>
+    <w:p>
+      <w:r>
+        <w:t xml:space="preserve">Current Main Files:</w:t>
+      </w:r>
+    </w:p>
+    <w:p>
+      <w:r>
+        <w:t xml:space="preserve">  - server/app.py = FastAPI entry point that serves /health, /api/app-info, the API router, and the browser UI shell</w:t>
+      </w:r>
+    </w:p>
+    <w:p>
+      <w:r>
+        <w:t xml:space="preserve">  - server/api/routes.py = operator and test API endpoints that call the low-level runtime actions</w:t>
+      </w:r>
+    </w:p>
+    <w:p>
+      <w:r>
+        <w:t xml:space="preserve">  - server/sim/link_state_machine.py = current low-level simulator runtime owner</w:t>
+      </w:r>
+    </w:p>
+    <w:p>
+      <w:r>
+        <w:t xml:space="preserve">  - server/transport/serial_link.py = one-owner serial manager for the COM endpoint</w:t>
+      </w:r>
+    </w:p>
+    <w:p>
+      <w:r>
+        <w:t xml:space="preserve">  - server/transport/frame_codec.py = framed packet encoder/decoder with CRC16</w:t>
+      </w:r>
+    </w:p>
+    <w:p>
+      <w:r>
+        <w:t xml:space="preserve">Implemented Low-Level Server States:</w:t>
+      </w:r>
+    </w:p>
+    <w:p>
+      <w:r>
+        <w:t xml:space="preserve">  - reset</w:t>
+      </w:r>
+    </w:p>
+    <w:p>
+      <w:r>
+        <w:t xml:space="preserve">  - initialize</w:t>
+      </w:r>
+    </w:p>
+    <w:p>
+      <w:r>
+        <w:t xml:space="preserve">  - connect</w:t>
+      </w:r>
+    </w:p>
+    <w:p>
+      <w:r>
+        <w:t xml:space="preserve">  - keepalive</w:t>
+      </w:r>
+    </w:p>
+    <w:p>
+      <w:r>
+        <w:t xml:space="preserve">  - send_data</w:t>
+      </w:r>
+    </w:p>
+    <w:p>
+      <w:r>
+        <w:t xml:space="preserve">  - error</w:t>
+      </w:r>
+    </w:p>
+    <w:p>
+      <w:r>
+        <w:t xml:space="preserve">Main Server Runtime Functions:</w:t>
+      </w:r>
+    </w:p>
+    <w:p>
+      <w:r>
+        <w:t xml:space="preserve">  - LinkRuntime.configure_port() = update the active serial port target</w:t>
+      </w:r>
+    </w:p>
+    <w:p>
+      <w:r>
+        <w:t xml:space="preserve">  - LinkRuntime.configure_transport() = update mirrored serial, Wi-Fi, TCP, and watchdog configuration</w:t>
+      </w:r>
+    </w:p>
+    <w:p>
+      <w:r>
+        <w:t xml:space="preserve">  - LinkRuntime.open_transport() = open and own the configured COM endpoint</w:t>
+      </w:r>
+    </w:p>
+    <w:p>
+      <w:r>
+        <w:t xml:space="preserve">  - LinkRuntime.close_transport() = release the configured COM endpoint and clear transport-ready flags</w:t>
+      </w:r>
+    </w:p>
+    <w:p>
+      <w:r>
+        <w:t xml:space="preserve">  - LinkRuntime.reset() = clear counters and watchdog state, send RESET, and return to reset baseline</w:t>
+      </w:r>
+    </w:p>
+    <w:p>
+      <w:r>
+        <w:t xml:space="preserve">  - LinkRuntime.initialize() = validate mirrored configuration, send INITIALIZE, auto-send CONNECT, and wait for the ESP connect response</w:t>
+      </w:r>
+    </w:p>
+    <w:p>
+      <w:r>
+        <w:t xml:space="preserve">  - LinkRuntime.send_keepalive() = increment HostLiveInteger, transmit KEEPALIVE, and supervise the active session</w:t>
+      </w:r>
+    </w:p>
+    <w:p>
+      <w:r>
+        <w:t xml:space="preserve">  - LinkRuntime.send_data() = transmit DATA only after connect success enables payload traffic</w:t>
+      </w:r>
+    </w:p>
+    <w:p>
+      <w:r>
+        <w:t xml:space="preserve">  - LinkRuntime.get_snapshot() = return the current operator-visible runtime snapshot</w:t>
+      </w:r>
+    </w:p>
+    <w:p>
+      <w:r>
+        <w:t xml:space="preserve">  - SerialLinkManager.open_port() / close_port() / send_frame() = the only code paths allowed to touch the serial object</w:t>
+      </w:r>
+    </w:p>
+    <w:p>
+      <w:r>
+        <w:t xml:space="preserve">Current UI Integration:</w:t>
+      </w:r>
+    </w:p>
+    <w:p>
+      <w:r>
+        <w:t xml:space="preserve">  - server/ui/index.html = browser operator dashboard that drives Screen 1, Screen 2, and Screen 3 through the API routes</w:t>
+      </w:r>
+    </w:p>
+    <w:p/>
+    <w:p>
+      <w:r>
+        <w:t xml:space="preserve">2.5 Current Implemented Split: ESP32-C3 Transport Controller Firmware</w:t>
+      </w:r>
+    </w:p>
+    <w:p>
+      <w:r>
+        <w:t xml:space="preserve">Current Main Files:</w:t>
+      </w:r>
+    </w:p>
+    <w:p>
+      <w:r>
+        <w:t xml:space="preserve">  - firmware/esp32c3_bridge/main/bridge_main.c = current ESP32-C3 transport-controller baseline</w:t>
+      </w:r>
+    </w:p>
+    <w:p>
+      <w:r>
+        <w:t xml:space="preserve">Implemented Bridge States:</w:t>
+      </w:r>
+    </w:p>
+    <w:p>
+      <w:r>
+        <w:t xml:space="preserve">  - BRIDGE_STATE_RESET</w:t>
+      </w:r>
+    </w:p>
+    <w:p>
+      <w:r>
+        <w:t xml:space="preserve">  - BRIDGE_STATE_INITIALIZE</w:t>
+      </w:r>
+    </w:p>
+    <w:p>
+      <w:r>
+        <w:t xml:space="preserve">  - BRIDGE_STATE_CONNECT</w:t>
+      </w:r>
+    </w:p>
+    <w:p>
+      <w:r>
+        <w:t xml:space="preserve">  - BRIDGE_STATE_DISCONNECT</w:t>
+      </w:r>
+    </w:p>
+    <w:p>
+      <w:r>
+        <w:t xml:space="preserve">  - BRIDGE_STATE_ERROR</w:t>
+      </w:r>
+    </w:p>
+    <w:p>
+      <w:r>
+        <w:t xml:space="preserve">Implemented Bridge Message Types:</w:t>
+      </w:r>
+    </w:p>
+    <w:p>
+      <w:r>
+        <w:t xml:space="preserve">  - BRIDGE_MESSAGE_RESET</w:t>
+      </w:r>
+    </w:p>
+    <w:p>
+      <w:r>
+        <w:t xml:space="preserve">  - BRIDGE_MESSAGE_INITIALIZE</w:t>
+      </w:r>
+    </w:p>
+    <w:p>
+      <w:r>
+        <w:t xml:space="preserve">  - BRIDGE_MESSAGE_CONNECT</w:t>
+      </w:r>
+    </w:p>
+    <w:p>
+      <w:r>
+        <w:t xml:space="preserve">  - BRIDGE_MESSAGE_DISCONNECT</w:t>
+      </w:r>
+    </w:p>
+    <w:p>
+      <w:r>
+        <w:t xml:space="preserve">  - BRIDGE_MESSAGE_KEEPALIVE</w:t>
+      </w:r>
+    </w:p>
+    <w:p>
+      <w:r>
+        <w:t xml:space="preserve">  - BRIDGE_MESSAGE_ERROR</w:t>
+      </w:r>
+    </w:p>
+    <w:p>
+      <w:r>
+        <w:t xml:space="preserve">  - BRIDGE_MESSAGE_ACK</w:t>
+      </w:r>
+    </w:p>
+    <w:p>
+      <w:r>
+        <w:t xml:space="preserve">  - BRIDGE_MESSAGE_DATA</w:t>
+      </w:r>
+    </w:p>
+    <w:p>
+      <w:r>
+        <w:t xml:space="preserve">Main Bridge Functions:</w:t>
+      </w:r>
+    </w:p>
+    <w:p>
+      <w:r>
+        <w:t xml:space="preserve">  - app_main() = USB-Serial/JTAG polling loop that reads frames and dispatches them</w:t>
+      </w:r>
+    </w:p>
+    <w:p>
+      <w:r>
+        <w:t xml:space="preserve">  - bridge_transport_init() = install and configure the USB-Serial/JTAG transport used as the COM endpoint</w:t>
+      </w:r>
+    </w:p>
+    <w:p>
+      <w:r>
+        <w:t xml:space="preserve">  - bridge_parse_frame() = validate framing, payload length, and CRC before accepting a request</w:t>
+      </w:r>
+    </w:p>
+    <w:p>
+      <w:r>
+        <w:t xml:space="preserve">  - bridge_handle_frame() = move the bridge state machine and emit the matching ACK or KEEPALIVE response</w:t>
+      </w:r>
+    </w:p>
+    <w:p>
+      <w:r>
+        <w:t xml:space="preserve">  - bridge_send_frame() = serialize and transmit one framed response back to the PC simulator host</w:t>
+      </w:r>
+    </w:p>
+    <w:p>
+      <w:r>
+        <w:t xml:space="preserve">  - bridge_crc16_ccitt() = shared integrity algorithm used for bridge-side frame validation and emission</w:t>
+      </w:r>
+    </w:p>
+    <w:p>
+      <w:r>
+        <w:t xml:space="preserve">Current Bridge Scope Limitation:</w:t>
+      </w:r>
+    </w:p>
+    <w:p>
+      <w:r>
+        <w:t xml:space="preserve">  - the ESP32-C3 firmware baseline currently acknowledges low-level framed traffic and state changes, but it does not yet implement the full real Wi-Fi/TCP forwarding path expected from the final transport-controller design</w:t>
+      </w:r>
+    </w:p>
+    <w:p/>
+    <w:p>
+      <w:r>
         <w:t xml:space="preserve">3. Low-Level State Machine Definition</w:t>
       </w:r>
     </w:p>
@@ -241,7 +513,12 @@
     </w:p>
     <w:p>
       <w:r>
-        <w:t xml:space="preserve">  disconnect</w:t>
+        <w:t xml:space="preserve">  keepalive</w:t>
+      </w:r>
+    </w:p>
+    <w:p>
+      <w:r>
+        <w:t xml:space="preserve">  send_data</w:t>
       </w:r>
     </w:p>
     <w:p>
@@ -256,27 +533,32 @@
     </w:p>
     <w:p>
       <w:r>
-        <w:t xml:space="preserve">  reset = hard reset, self-test, counter clear, buffer clear, and transport parameter load</w:t>
-      </w:r>
-    </w:p>
-    <w:p>
-      <w:r>
-        <w:t xml:space="preserve">  initialize = prepare the low-level stack from reset parameters but do not yet claim link health</w:t>
-      </w:r>
-    </w:p>
-    <w:p>
-      <w:r>
-        <w:t xml:space="preserve">  connect = establish and supervise the active low-level session</w:t>
-      </w:r>
-    </w:p>
-    <w:p>
-      <w:r>
-        <w:t xml:space="preserve">  disconnect = perform controlled link shutdown</w:t>
-      </w:r>
-    </w:p>
-    <w:p>
-      <w:r>
-        <w:t xml:space="preserve">  error = latch fault state and wait only for reset or initialize</w:t>
+        <w:t xml:space="preserve">  reset = hard reset, counter clear, buffer clear, and ESP controller re-initialization</w:t>
+      </w:r>
+    </w:p>
+    <w:p>
+      <w:r>
+        <w:t xml:space="preserve">  initialize = load the ESP controller with mirrored Wi-Fi and server constants, then auto-start connect</w:t>
+      </w:r>
+    </w:p>
+    <w:p>
+      <w:r>
+        <w:t xml:space="preserve">  connect = wait for the ESP controller connect response</w:t>
+      </w:r>
+    </w:p>
+    <w:p>
+      <w:r>
+        <w:t xml:space="preserve">  keepalive = active low-level supervision after connect success</w:t>
+      </w:r>
+    </w:p>
+    <w:p>
+      <w:r>
+        <w:t xml:space="preserve">  send_data = active payload state that remains allowed only while keepalive supervision is healthy</w:t>
+      </w:r>
+    </w:p>
+    <w:p>
+      <w:r>
+        <w:t xml:space="preserve">  error = latch fault state and wait only for reset</w:t>
       </w:r>
     </w:p>
     <w:p>
@@ -286,12 +568,12 @@
     </w:p>
     <w:p>
       <w:r>
-        <w:t xml:space="preserve">  reset -&gt; initialize -&gt; connect</w:t>
-      </w:r>
-    </w:p>
-    <w:p>
-      <w:r>
-        <w:t xml:space="preserve">  connect -&gt; disconnect -&gt; reset</w:t>
+        <w:t xml:space="preserve">  reset -&gt; initialize -&gt; connect -&gt; keepalive -&gt; send_data</w:t>
+      </w:r>
+    </w:p>
+    <w:p>
+      <w:r>
+        <w:t xml:space="preserve">  send_data -&gt; keepalive when keepalive is explicitly resumed</w:t>
       </w:r>
     </w:p>
     <w:p>
@@ -306,17 +588,17 @@
     </w:p>
     <w:p>
       <w:r>
-        <w:t xml:space="preserve">  disconnect -&gt; error only if controlled shutdown itself fails</w:t>
+        <w:t xml:space="preserve">  keepalive -&gt; error when supervision fails</w:t>
+      </w:r>
+    </w:p>
+    <w:p>
+      <w:r>
+        <w:t xml:space="preserve">  send_data -&gt; error when supervision fails</w:t>
       </w:r>
     </w:p>
     <w:p>
       <w:r>
         <w:t xml:space="preserve">  error -&gt; reset</w:t>
-      </w:r>
-    </w:p>
-    <w:p>
-      <w:r>
-        <w:t xml:space="preserve">  error -&gt; initialize</w:t>
       </w:r>
     </w:p>
     <w:p>
@@ -844,27 +1126,32 @@
     <w:p/>
     <w:p>
       <w:r>
-        <w:t xml:space="preserve">6.4 DISCONNECT Packet Flow</w:t>
-      </w:r>
-    </w:p>
-    <w:p>
-      <w:r>
-        <w:t xml:space="preserve">  PC Host -&gt; DISCONNECT(reason)</w:t>
-      </w:r>
-    </w:p>
-    <w:p>
-      <w:r>
-        <w:t xml:space="preserve">  ESP32-C3 -&gt; close low-level session in a controlled manner</w:t>
-      </w:r>
-    </w:p>
-    <w:p>
-      <w:r>
-        <w:t xml:space="preserve">  ESP32-C3 -&gt; DISCONNECT_ACK</w:t>
-      </w:r>
-    </w:p>
-    <w:p>
-      <w:r>
-        <w:t xml:space="preserve">  PC Host -&gt; return to reset or supervisory idle logic</w:t>
+        <w:t xml:space="preserve">6.4 KEEPALIVE Packet Flow</w:t>
+      </w:r>
+    </w:p>
+    <w:p>
+      <w:r>
+        <w:t xml:space="preserve">  Every 100 mSec PC Host -&gt; KEEPALIVE(host_live_integer incremented)</w:t>
+      </w:r>
+    </w:p>
+    <w:p>
+      <w:r>
+        <w:t xml:space="preserve">  ESP32-C3 -&gt; verify host counter advanced within 100 mSec window</w:t>
+      </w:r>
+    </w:p>
+    <w:p>
+      <w:r>
+        <w:t xml:space="preserve">  ESP32-C3 -&gt; KEEPALIVE_ACK(device_live_integer, link health, transport status)</w:t>
+      </w:r>
+    </w:p>
+    <w:p>
+      <w:r>
+        <w:t xml:space="preserve">  PC Host -&gt; verify response timing and device counter progress</w:t>
+      </w:r>
+    </w:p>
+    <w:p>
+      <w:r>
+        <w:t xml:space="preserve">  If expected progress is missing -&gt; both sides transition to error</w:t>
       </w:r>
     </w:p>
     <w:p>
@@ -875,7 +1162,7 @@
         <w:rPr>
           <w:i/>
         </w:rPr>
-        <w:t xml:space="preserve">Figure 6. Simulator DISCONNECT packet flow for intentional transport shutdown.</w:t>
+        <w:t xml:space="preserve">Figure 6. Simulator KEEPALIVE packet flow with host-owned liveness and bridge status acknowledgement.</w:t>
       </w:r>
     </w:p>
     <w:p>
@@ -887,7 +1174,7 @@
           <wp:inline distT="0" distB="0" distL="0" distR="0">
             <wp:extent cx="5669280" cy="1984248"/>
             <wp:effectExtent l="0" t="0" r="0" b="0"/>
-            <wp:docPr id="106" name="packet_disconnect_flow.png"/>
+            <wp:docPr id="106" name="packet_keepalive_flow.png"/>
             <wp:cNvGraphicFramePr>
               <a:graphicFrameLocks xmlns:a="http://schemas.openxmlformats.org/drawingml/2006/main" noChangeAspect="1"/>
             </wp:cNvGraphicFramePr>
@@ -895,7 +1182,7 @@
               <a:graphicData uri="http://schemas.openxmlformats.org/drawingml/2006/picture">
                 <pic:pic xmlns:pic="http://schemas.openxmlformats.org/drawingml/2006/picture">
                   <pic:nvPicPr>
-                    <pic:cNvPr id="106" name="packet_disconnect_flow.png"/>
+                    <pic:cNvPr id="106" name="packet_keepalive_flow.png"/>
                     <pic:cNvPicPr/>
                   </pic:nvPicPr>
                   <pic:blipFill>
@@ -924,32 +1211,32 @@
     <w:p/>
     <w:p>
       <w:r>
-        <w:t xml:space="preserve">6.5 KEEPALIVE Packet Flow</w:t>
-      </w:r>
-    </w:p>
-    <w:p>
-      <w:r>
-        <w:t xml:space="preserve">  Every 100 mSec PC Host -&gt; KEEPALIVE(host_live_integer incremented)</w:t>
-      </w:r>
-    </w:p>
-    <w:p>
-      <w:r>
-        <w:t xml:space="preserve">  ESP32-C3 -&gt; verify host counter advanced within 100 mSec window</w:t>
-      </w:r>
-    </w:p>
-    <w:p>
-      <w:r>
-        <w:t xml:space="preserve">  ESP32-C3 -&gt; KEEPALIVE_ACK(device_live_integer, link health, transport status)</w:t>
-      </w:r>
-    </w:p>
-    <w:p>
-      <w:r>
-        <w:t xml:space="preserve">  PC Host -&gt; verify response timing and device counter progress</w:t>
-      </w:r>
-    </w:p>
-    <w:p>
-      <w:r>
-        <w:t xml:space="preserve">  If expected progress is missing -&gt; both sides transition to error</w:t>
+        <w:t xml:space="preserve">6.5 DATA Packet Flow</w:t>
+      </w:r>
+    </w:p>
+    <w:p>
+      <w:r>
+        <w:t xml:space="preserve">  PC Host simulator logic -&gt; DATA(application payload)</w:t>
+      </w:r>
+    </w:p>
+    <w:p>
+      <w:r>
+        <w:t xml:space="preserve">  ESP32-C3 -&gt; validate frame and CRC</w:t>
+      </w:r>
+    </w:p>
+    <w:p>
+      <w:r>
+        <w:t xml:space="preserve">  ESP32-C3 -&gt; transmit payload over Wi-Fi TCP to client</w:t>
+      </w:r>
+    </w:p>
+    <w:p>
+      <w:r>
+        <w:t xml:space="preserve">  Client -&gt; respond with DATA or ACK</w:t>
+      </w:r>
+    </w:p>
+    <w:p>
+      <w:r>
+        <w:t xml:space="preserve">  ESP32-C3 -&gt; forward validated response to PC host</w:t>
       </w:r>
     </w:p>
     <w:p>
@@ -960,7 +1247,7 @@
         <w:rPr>
           <w:i/>
         </w:rPr>
-        <w:t xml:space="preserve">Figure 7. Simulator KEEPALIVE packet flow with host-owned liveness and bridge status acknowledgement.</w:t>
+        <w:t xml:space="preserve">Figure 7. Simulator DATA packet flow showing bridge-side validation before forwarding.</w:t>
       </w:r>
     </w:p>
     <w:p>
@@ -972,7 +1259,7 @@
           <wp:inline distT="0" distB="0" distL="0" distR="0">
             <wp:extent cx="5669280" cy="1984248"/>
             <wp:effectExtent l="0" t="0" r="0" b="0"/>
-            <wp:docPr id="107" name="packet_keepalive_flow.png"/>
+            <wp:docPr id="107" name="packet_data_flow.png"/>
             <wp:cNvGraphicFramePr>
               <a:graphicFrameLocks xmlns:a="http://schemas.openxmlformats.org/drawingml/2006/main" noChangeAspect="1"/>
             </wp:cNvGraphicFramePr>
@@ -980,7 +1267,7 @@
               <a:graphicData uri="http://schemas.openxmlformats.org/drawingml/2006/picture">
                 <pic:pic xmlns:pic="http://schemas.openxmlformats.org/drawingml/2006/picture">
                   <pic:nvPicPr>
-                    <pic:cNvPr id="107" name="packet_keepalive_flow.png"/>
+                    <pic:cNvPr id="107" name="packet_data_flow.png"/>
                     <pic:cNvPicPr/>
                   </pic:nvPicPr>
                   <pic:blipFill>
@@ -1009,32 +1296,27 @@
     <w:p/>
     <w:p>
       <w:r>
-        <w:t xml:space="preserve">6.6 DATA Packet Flow</w:t>
-      </w:r>
-    </w:p>
-    <w:p>
-      <w:r>
-        <w:t xml:space="preserve">  PC Host simulator logic -&gt; DATA(application payload)</w:t>
-      </w:r>
-    </w:p>
-    <w:p>
-      <w:r>
-        <w:t xml:space="preserve">  ESP32-C3 -&gt; validate frame and CRC</w:t>
-      </w:r>
-    </w:p>
-    <w:p>
-      <w:r>
-        <w:t xml:space="preserve">  ESP32-C3 -&gt; transmit payload over Wi-Fi TCP to client</w:t>
-      </w:r>
-    </w:p>
-    <w:p>
-      <w:r>
-        <w:t xml:space="preserve">  Client -&gt; respond with DATA or ACK</w:t>
-      </w:r>
-    </w:p>
-    <w:p>
-      <w:r>
-        <w:t xml:space="preserve">  ESP32-C3 -&gt; forward validated response to PC host</w:t>
+        <w:t xml:space="preserve">6.6 ERROR Packet Flow</w:t>
+      </w:r>
+    </w:p>
+    <w:p>
+      <w:r>
+        <w:t xml:space="preserve">  ESP32-C3 or client low-level layer detects fault</w:t>
+      </w:r>
+    </w:p>
+    <w:p>
+      <w:r>
+        <w:t xml:space="preserve">  Faulting side -&gt; ERROR(error code, state, counters, transport summary)</w:t>
+      </w:r>
+    </w:p>
+    <w:p>
+      <w:r>
+        <w:t xml:space="preserve">  Receiving side -&gt; stop trusting link health and enter supervisory recovery</w:t>
+      </w:r>
+    </w:p>
+    <w:p>
+      <w:r>
+        <w:t xml:space="preserve">  Recovery command must be reset</w:t>
       </w:r>
     </w:p>
     <w:p>
@@ -1045,7 +1327,7 @@
         <w:rPr>
           <w:i/>
         </w:rPr>
-        <w:t xml:space="preserve">Figure 8. Simulator DATA packet flow showing bridge-side validation before forwarding.</w:t>
+        <w:t xml:space="preserve">Figure 8. Simulator ERROR packet flow preserving low-level fault context for explicit recovery.</w:t>
       </w:r>
     </w:p>
     <w:p>
@@ -1057,7 +1339,7 @@
           <wp:inline distT="0" distB="0" distL="0" distR="0">
             <wp:extent cx="5669280" cy="1984248"/>
             <wp:effectExtent l="0" t="0" r="0" b="0"/>
-            <wp:docPr id="108" name="packet_data_flow.png"/>
+            <wp:docPr id="108" name="packet_error_flow.png"/>
             <wp:cNvGraphicFramePr>
               <a:graphicFrameLocks xmlns:a="http://schemas.openxmlformats.org/drawingml/2006/main" noChangeAspect="1"/>
             </wp:cNvGraphicFramePr>
@@ -1065,7 +1347,7 @@
               <a:graphicData uri="http://schemas.openxmlformats.org/drawingml/2006/picture">
                 <pic:pic xmlns:pic="http://schemas.openxmlformats.org/drawingml/2006/picture">
                   <pic:nvPicPr>
-                    <pic:cNvPr id="108" name="packet_data_flow.png"/>
+                    <pic:cNvPr id="108" name="packet_error_flow.png"/>
                     <pic:cNvPicPr/>
                   </pic:nvPicPr>
                   <pic:blipFill>
@@ -1094,27 +1376,43 @@
     <w:p/>
     <w:p>
       <w:r>
-        <w:t xml:space="preserve">6.7 ERROR Packet Flow</w:t>
-      </w:r>
-    </w:p>
-    <w:p>
-      <w:r>
-        <w:t xml:space="preserve">  ESP32-C3 or client low-level layer detects fault</w:t>
-      </w:r>
-    </w:p>
-    <w:p>
-      <w:r>
-        <w:t xml:space="preserve">  Faulting side -&gt; ERROR(error code, state, counters, transport summary)</w:t>
-      </w:r>
-    </w:p>
-    <w:p>
-      <w:r>
-        <w:t xml:space="preserve">  Receiving side -&gt; stop trusting link health and enter supervisory recovery</w:t>
-      </w:r>
-    </w:p>
-    <w:p>
-      <w:r>
-        <w:t xml:space="preserve">  Recovery command must be reset or initialize</w:t>
+        <w:t xml:space="preserve">7. Keep-Alive and Watchdog Policy</w:t>
+      </w:r>
+    </w:p>
+    <w:p>
+      <w:r>
+        <w:t xml:space="preserve">Timing Rule: every healthy connected session shall exchange keep-alive traffic every 100 mSec.</w:t>
+      </w:r>
+    </w:p>
+    <w:p>
+      <w:r>
+        <w:t xml:space="preserve">Failure Trigger: if a message was not responded to with the expected liveness progress within 100 mSec, the low-level controller shall move to error.</w:t>
+      </w:r>
+    </w:p>
+    <w:p>
+      <w:r>
+        <w:t xml:space="preserve">Host Ownership Rule: the host-side simulator shall increment HostLiveInteger. This is preferable because it proves the upper-level PC application is still making forward progress.</w:t>
+      </w:r>
+    </w:p>
+    <w:p>
+      <w:r>
+        <w:t xml:space="preserve">Device Visibility Rule: the ESP32-C3 should also increment DeviceLiveInteger in responses so the PC can independently detect bridge-side stalls.</w:t>
+      </w:r>
+    </w:p>
+    <w:p>
+      <w:r>
+        <w:t xml:space="preserve">Why Not Only a Giant Standard Data Packet: if keep-alive is embedded only in full-state data packets, then transport health becomes coupled to application payload frequency. Dedicated keep-alive frames are more reliable.</w:t>
+      </w:r>
+    </w:p>
+    <w:p/>
+    <w:p>
+      <w:r>
+        <w:t xml:space="preserve">8. Failure Modes and Respective State Diagrams</w:t>
+      </w:r>
+    </w:p>
+    <w:p>
+      <w:r>
+        <w:t xml:space="preserve">A low-level transport fault shall always force a transition into the shared error state before higher-level simulator logic consumes any additional payload.</w:t>
       </w:r>
     </w:p>
     <w:p>
@@ -1125,7 +1423,7 @@
         <w:rPr>
           <w:i/>
         </w:rPr>
-        <w:t xml:space="preserve">Figure 9. Simulator ERROR packet flow preserving low-level fault context for explicit recovery.</w:t>
+        <w:t xml:space="preserve">Figure 9. Simulator failure overview spanning CRC faults, watchdog failures, COM faults, Wi-Fi faults, and TCP session loss.</w:t>
       </w:r>
     </w:p>
     <w:p>
@@ -1135,9 +1433,9 @@
       <w:r>
         <w:drawing>
           <wp:inline distT="0" distB="0" distL="0" distR="0">
-            <wp:extent cx="5669280" cy="1984248"/>
+            <wp:extent cx="5669280" cy="3092335"/>
             <wp:effectExtent l="0" t="0" r="0" b="0"/>
-            <wp:docPr id="109" name="packet_error_flow.png"/>
+            <wp:docPr id="109" name="failure_modes_overview.png"/>
             <wp:cNvGraphicFramePr>
               <a:graphicFrameLocks xmlns:a="http://schemas.openxmlformats.org/drawingml/2006/main" noChangeAspect="1"/>
             </wp:cNvGraphicFramePr>
@@ -1145,107 +1443,11 @@
               <a:graphicData uri="http://schemas.openxmlformats.org/drawingml/2006/picture">
                 <pic:pic xmlns:pic="http://schemas.openxmlformats.org/drawingml/2006/picture">
                   <pic:nvPicPr>
-                    <pic:cNvPr id="109" name="packet_error_flow.png"/>
+                    <pic:cNvPr id="109" name="failure_modes_overview.png"/>
                     <pic:cNvPicPr/>
                   </pic:nvPicPr>
                   <pic:blipFill>
                     <a:blip r:embed="rId9"/>
-                    <a:stretch>
-                      <a:fillRect/>
-                    </a:stretch>
-                  </pic:blipFill>
-                  <pic:spPr>
-                    <a:xfrm>
-                      <a:off x="0" y="0"/>
-                      <a:ext cx="5669280" cy="1984248"/>
-                    </a:xfrm>
-                    <a:prstGeom prst="rect">
-                      <a:avLst/>
-                    </a:prstGeom>
-                  </pic:spPr>
-                </pic:pic>
-              </a:graphicData>
-            </a:graphic>
-          </wp:inline>
-        </w:drawing>
-      </w:r>
-    </w:p>
-    <w:p/>
-    <w:p/>
-    <w:p>
-      <w:r>
-        <w:t xml:space="preserve">7. Keep-Alive and Watchdog Policy</w:t>
-      </w:r>
-    </w:p>
-    <w:p>
-      <w:r>
-        <w:t xml:space="preserve">Timing Rule: every healthy connected session shall exchange keep-alive traffic every 100 mSec.</w:t>
-      </w:r>
-    </w:p>
-    <w:p>
-      <w:r>
-        <w:t xml:space="preserve">Failure Trigger: if a message was not responded to with the expected liveness progress within 100 mSec, the low-level controller shall move to error.</w:t>
-      </w:r>
-    </w:p>
-    <w:p>
-      <w:r>
-        <w:t xml:space="preserve">Host Ownership Rule: the host-side simulator shall increment HostLiveInteger. This is preferable because it proves the upper-level PC application is still making forward progress.</w:t>
-      </w:r>
-    </w:p>
-    <w:p>
-      <w:r>
-        <w:t xml:space="preserve">Device Visibility Rule: the ESP32-C3 should also increment DeviceLiveInteger in responses so the PC can independently detect bridge-side stalls.</w:t>
-      </w:r>
-    </w:p>
-    <w:p>
-      <w:r>
-        <w:t xml:space="preserve">Why Not Only a Giant Standard Data Packet: if keep-alive is embedded only in full-state data packets, then transport health becomes coupled to application payload frequency. Dedicated keep-alive frames are more reliable.</w:t>
-      </w:r>
-    </w:p>
-    <w:p/>
-    <w:p>
-      <w:r>
-        <w:t xml:space="preserve">8. Failure Modes and Respective State Diagrams</w:t>
-      </w:r>
-    </w:p>
-    <w:p>
-      <w:r>
-        <w:t xml:space="preserve">A low-level transport fault shall always force a transition into the shared error state before higher-level simulator logic consumes any additional payload.</w:t>
-      </w:r>
-    </w:p>
-    <w:p>
-      <w:pPr>
-        <w:jc w:val="center"/>
-      </w:pPr>
-      <w:r>
-        <w:rPr>
-          <w:i/>
-        </w:rPr>
-        <w:t xml:space="preserve">Figure 10. Simulator failure overview spanning CRC faults, watchdog failures, COM faults, Wi-Fi faults, and TCP session loss.</w:t>
-      </w:r>
-    </w:p>
-    <w:p>
-      <w:pPr>
-        <w:jc w:val="center"/>
-      </w:pPr>
-      <w:r>
-        <w:drawing>
-          <wp:inline distT="0" distB="0" distL="0" distR="0">
-            <wp:extent cx="5669280" cy="3092335"/>
-            <wp:effectExtent l="0" t="0" r="0" b="0"/>
-            <wp:docPr id="110" name="failure_modes_overview.png"/>
-            <wp:cNvGraphicFramePr>
-              <a:graphicFrameLocks xmlns:a="http://schemas.openxmlformats.org/drawingml/2006/main" noChangeAspect="1"/>
-            </wp:cNvGraphicFramePr>
-            <a:graphic xmlns:a="http://schemas.openxmlformats.org/drawingml/2006/main">
-              <a:graphicData uri="http://schemas.openxmlformats.org/drawingml/2006/picture">
-                <pic:pic xmlns:pic="http://schemas.openxmlformats.org/drawingml/2006/picture">
-                  <pic:nvPicPr>
-                    <pic:cNvPr id="110" name="failure_modes_overview.png"/>
-                    <pic:cNvPicPr/>
-                  </pic:nvPicPr>
-                  <pic:blipFill>
-                    <a:blip r:embed="rId10"/>
                     <a:stretch>
                       <a:fillRect/>
                     </a:stretch>
@@ -1297,11 +1499,6 @@
         <w:t xml:space="preserve">  error -&gt; reset</w:t>
       </w:r>
     </w:p>
-    <w:p>
-      <w:r>
-        <w:t xml:space="preserve">  error -&gt; initialize</w:t>
-      </w:r>
-    </w:p>
     <w:p/>
     <w:p>
       <w:r>
@@ -1330,7 +1527,7 @@
     </w:p>
     <w:p>
       <w:r>
-        <w:t xml:space="preserve">  error -&gt; reset or initialize after host recovers</w:t>
+        <w:t xml:space="preserve">  error -&gt; reset after host recovers</w:t>
       </w:r>
     </w:p>
     <w:p/>
@@ -1351,7 +1548,7 @@
     </w:p>
     <w:p>
       <w:r>
-        <w:t xml:space="preserve">  connect -&gt; expected keepalive ack missing -&gt; error</w:t>
+        <w:t xml:space="preserve">  keepalive -&gt; expected keepalive ack missing -&gt; error</w:t>
       </w:r>
     </w:p>
     <w:p>
@@ -1635,12 +1832,12 @@
     <w:p/>
     <w:p>
       <w:r>
-        <w:t xml:space="preserve">8.8 Intentional Disconnect</w:t>
-      </w:r>
-    </w:p>
-    <w:p>
-      <w:r>
-        <w:t xml:space="preserve">Description: upper-level host requests controlled shutdown.</w:t>
+        <w:t xml:space="preserve">8.8 Reset-Only Error Recovery</w:t>
+      </w:r>
+    </w:p>
+    <w:p>
+      <w:r>
+        <w:t xml:space="preserve">Description: any latched low-level error may be cleared only by reset.</w:t>
       </w:r>
     </w:p>
     <w:p>
@@ -1650,7 +1847,7 @@
     </w:p>
     <w:p>
       <w:r>
-        <w:t xml:space="preserve">  connect -&gt; disconnect -&gt; reset</w:t>
+        <w:t xml:space="preserve">  error -&gt; reset -&gt; initialize -&gt; connect</w:t>
       </w:r>
     </w:p>
     <w:p>
@@ -1660,7 +1857,7 @@
     </w:p>
     <w:p>
       <w:r>
-        <w:t xml:space="preserve">  reset -&gt; initialize -&gt; connect when commanded</w:t>
+        <w:t xml:space="preserve">  no direct initialize-from-error path is allowed</w:t>
       </w:r>
     </w:p>
     <w:p/>
@@ -1681,6 +1878,21 @@
     </w:p>
     <w:p>
       <w:r>
+        <w:t xml:space="preserve">  ServerInterface/frame_codec.py = shared Python reference implementation of the portable transport framing rules</w:t>
+      </w:r>
+    </w:p>
+    <w:p>
+      <w:r>
+        <w:t xml:space="preserve">  ServerInterface/native/include/server_interface/*.hpp and c_api.h = portable native protocol headers intended for MCU reuse</w:t>
+      </w:r>
+    </w:p>
+    <w:p>
+      <w:r>
+        <w:t xml:space="preserve">  ServerInterface/native/src/protocol.cpp = native framing and CRC implementation intended for later STM32 reuse through the same C API</w:t>
+      </w:r>
+    </w:p>
+    <w:p>
+      <w:r>
         <w:t xml:space="preserve">  server/app.py = FastAPI entry point</w:t>
       </w:r>
     </w:p>
@@ -1706,6 +1918,16 @@
     </w:p>
     <w:p>
       <w:r>
+        <w:t xml:space="preserve">  server/transport/frame_codec.py = compatibility shim that re-exports the extracted ServerInterface Python reference module</w:t>
+      </w:r>
+    </w:p>
+    <w:p>
+      <w:r>
+        <w:t xml:space="preserve">Shared-Interface Rule: transport framing, CRC, packet enums, and later low-level state-machine entry points shall move into ServerInterface first so the PC server and future STM32 firmware can exercise the same interface contract.</w:t>
+      </w:r>
+    </w:p>
+    <w:p>
+      <w:r>
         <w:t xml:space="preserve">Planned Firmware Boundary: the ESP32-C3 firmware should become a separate low-level transport project rather than being hidden inside the PC simulator application.</w:t>
       </w:r>
     </w:p>
@@ -1747,12 +1969,12 @@
     </w:p>
     <w:p>
       <w:r>
-        <w:t xml:space="preserve">  - Application Version = 0.1.6 from repository root VERSION</w:t>
-      </w:r>
-    </w:p>
-    <w:p>
-      <w:r>
-        <w:t xml:space="preserve">  - Firmware Version = 0.1.0 from firmware/esp32c3_bridge/VERSION</w:t>
+        <w:t xml:space="preserve">  - Application Version = 0.1.9 from repository root VERSION</w:t>
+      </w:r>
+    </w:p>
+    <w:p>
+      <w:r>
+        <w:t xml:space="preserve">  - Firmware Version = 0.1.9 from firmware/esp32c3_bridge/VERSION</w:t>
       </w:r>
     </w:p>
     <w:p>
@@ -2249,7 +2471,7 @@
     </w:p>
     <w:p>
       <w:r>
-        <w:t xml:space="preserve">Machine State Color Rules:</w:t>
+        <w:t xml:space="preserve">Server State Color Rules:</w:t>
       </w:r>
     </w:p>
     <w:p>
@@ -2274,7 +2496,7 @@
     </w:p>
     <w:p>
       <w:r>
-        <w:t xml:space="preserve">Grouping Rule: machine-state indication shall be shown in a dedicated titled group box named Machine State so state reporting remains visually separate from operator commands.</w:t>
+        <w:t xml:space="preserve">Grouping Rule: server-state indication shall be shown in a dedicated titled group box named Server States so state reporting remains visually separate from operator commands.</w:t>
       </w:r>
     </w:p>
     <w:p>

</xml_diff>

<commit_message>
release: bump simulator version to 0.1.11
</commit_message>
<xml_diff>
--- a/docs/EyalEspressoServerSimulatorDetailedDesign.docx
+++ b/docs/EyalEspressoServerSimulatorDetailedDesign.docx
@@ -14,12 +14,12 @@
     </w:p>
     <w:p>
       <w:r>
-        <w:t xml:space="preserve">Project Version Reference: 0.1.9</w:t>
-      </w:r>
-    </w:p>
-    <w:p>
-      <w:r>
-        <w:t xml:space="preserve">Reviewed on: 11-Mar-26 15:55:25</w:t>
+        <w:t xml:space="preserve">Project Version Reference: 0.1.10</w:t>
+      </w:r>
+    </w:p>
+    <w:p>
+      <w:r>
+        <w:t xml:space="preserve">Reviewed on: 11-Mar-26 16:05:32</w:t>
       </w:r>
     </w:p>
     <w:p>
@@ -306,12 +306,12 @@
     </w:p>
     <w:p>
       <w:r>
-        <w:t xml:space="preserve">  - LinkRuntime.reset() = clear counters and watchdog state, send RESET, and return to reset baseline</w:t>
-      </w:r>
-    </w:p>
-    <w:p>
-      <w:r>
-        <w:t xml:space="preserve">  - LinkRuntime.initialize() = validate mirrored configuration, send INITIALIZE, auto-send CONNECT, and wait for the ESP connect response</w:t>
+        <w:t xml:space="preserve">  - LinkRuntime.reset() = clear counters and watchdog state, send RESET, and arm automatic initialize progression</w:t>
+      </w:r>
+    </w:p>
+    <w:p>
+      <w:r>
+        <w:t xml:space="preserve">  - LinkRuntime.initialize() = validate mirrored configuration, send INITIALIZE, and schedule the automatic CONNECT stage</w:t>
       </w:r>
     </w:p>
     <w:p>
@@ -533,12 +533,12 @@
     </w:p>
     <w:p>
       <w:r>
-        <w:t xml:space="preserve">  reset = hard reset, counter clear, buffer clear, and ESP controller re-initialization</w:t>
-      </w:r>
-    </w:p>
-    <w:p>
-      <w:r>
-        <w:t xml:space="preserve">  initialize = load the ESP controller with mirrored Wi-Fi and server constants, then auto-start connect</w:t>
+        <w:t xml:space="preserve">  reset = hard reset, counter clear, buffer clear, ESP controller re-initialization, and automatic initialize arming</w:t>
+      </w:r>
+    </w:p>
+    <w:p>
+      <w:r>
+        <w:t xml:space="preserve">  initialize = load the ESP controller with mirrored Wi-Fi and server constants before automatic connect</w:t>
       </w:r>
     </w:p>
     <w:p>
@@ -662,12 +662,12 @@
     </w:p>
     <w:p>
       <w:r>
-        <w:t xml:space="preserve">  - reset shall clear stale socket ownership and stale COM-port session assumptions</w:t>
-      </w:r>
-    </w:p>
-    <w:p>
-      <w:r>
-        <w:t xml:space="preserve">  - initialize shall verify that Wi-Fi credentials, TCP role, target address, and watchdog values are coherent</w:t>
+        <w:t xml:space="preserve">  - reset shall clear stale socket ownership and stale COM-port session assumptions, then arm automatic initialize progression</w:t>
+      </w:r>
+    </w:p>
+    <w:p>
+      <w:r>
+        <w:t xml:space="preserve">  - initialize shall verify that Wi-Fi credentials, TCP role, target address, and watchdog values are coherent before automatic connect</w:t>
       </w:r>
     </w:p>
     <w:p>
@@ -901,7 +901,7 @@
     </w:p>
     <w:p>
       <w:r>
-        <w:t xml:space="preserve">  PC Host -&gt; if reset succeeded then send initialize</w:t>
+        <w:t xml:space="preserve">  PC Host runtime -&gt; if reset succeeded then automatically enter initialize</w:t>
       </w:r>
     </w:p>
     <w:p>
@@ -986,7 +986,7 @@
     </w:p>
     <w:p>
       <w:r>
-        <w:t xml:space="preserve">  PC Host -&gt; if initialize succeeded then send connect</w:t>
+        <w:t xml:space="preserve">  PC Host runtime -&gt; if initialize succeeded then automatically enter connect</w:t>
       </w:r>
     </w:p>
     <w:p>
@@ -1969,12 +1969,12 @@
     </w:p>
     <w:p>
       <w:r>
-        <w:t xml:space="preserve">  - Application Version = 0.1.9 from repository root VERSION</w:t>
-      </w:r>
-    </w:p>
-    <w:p>
-      <w:r>
-        <w:t xml:space="preserve">  - Firmware Version = 0.1.9 from firmware/esp32c3_bridge/VERSION</w:t>
+        <w:t xml:space="preserve">  - Application Version = 0.1.10 from repository root VERSION</w:t>
+      </w:r>
+    </w:p>
+    <w:p>
+      <w:r>
+        <w:t xml:space="preserve">  - Firmware Version = 0.1.10 from firmware/esp32c3_bridge/VERSION</w:t>
       </w:r>
     </w:p>
     <w:p>

</xml_diff>

<commit_message>
docs: add bright editable text control rule
</commit_message>
<xml_diff>
--- a/docs/EyalEspressoServerSimulatorDetailedDesign.docx
+++ b/docs/EyalEspressoServerSimulatorDetailedDesign.docx
@@ -14,12 +14,12 @@
     </w:p>
     <w:p>
       <w:r>
-        <w:t xml:space="preserve">Project Version Reference: 0.1.10</w:t>
-      </w:r>
-    </w:p>
-    <w:p>
-      <w:r>
-        <w:t xml:space="preserve">Reviewed on: 11-Mar-26 16:05:32</w:t>
+        <w:t xml:space="preserve">Project Version Reference: 0.1.13</w:t>
+      </w:r>
+    </w:p>
+    <w:p>
+      <w:r>
+        <w:t xml:space="preserve">Reviewed on: 11-Mar-26 17:05:16</w:t>
       </w:r>
     </w:p>
     <w:p>
@@ -1969,12 +1969,12 @@
     </w:p>
     <w:p>
       <w:r>
-        <w:t xml:space="preserve">  - Application Version = 0.1.10 from repository root VERSION</w:t>
-      </w:r>
-    </w:p>
-    <w:p>
-      <w:r>
-        <w:t xml:space="preserve">  - Firmware Version = 0.1.10 from firmware/esp32c3_bridge/VERSION</w:t>
+        <w:t xml:space="preserve">  - Application Version = 0.1.13 from repository root VERSION</w:t>
+      </w:r>
+    </w:p>
+    <w:p>
+      <w:r>
+        <w:t xml:space="preserve">  - Firmware Version = 0.1.12 from firmware/esp32c3_bridge/VERSION</w:t>
       </w:r>
     </w:p>
     <w:p>
@@ -2497,6 +2497,11 @@
     <w:p>
       <w:r>
         <w:t xml:space="preserve">Grouping Rule: server-state indication shall be shown in a dedicated titled group box named Server States so state reporting remains visually separate from operator commands.</w:t>
+      </w:r>
+    </w:p>
+    <w:p>
+      <w:r>
+        <w:t xml:space="preserve">Editable Text Rule: all editable text controls in the simulator UI shall use a bright fill with a light visible frame so writable fields are visually distinct from static text boxes.</w:t>
       </w:r>
     </w:p>
     <w:p>

</xml_diff>

<commit_message>
Release v0.1.15 - add SoftAP TCP bridge transport
</commit_message>
<xml_diff>
--- a/docs/EyalEspressoServerSimulatorDetailedDesign.docx
+++ b/docs/EyalEspressoServerSimulatorDetailedDesign.docx
@@ -19,7 +19,7 @@
     </w:p>
     <w:p>
       <w:r>
-        <w:t xml:space="preserve">Reviewed on: 11-Mar-26 17:05:16</w:t>
+        <w:t xml:space="preserve">Reviewed on: 11-Mar-26 17:58:22</w:t>
       </w:r>
     </w:p>
     <w:p>
@@ -703,7 +703,7 @@
     </w:p>
     <w:p>
       <w:r>
-        <w:t xml:space="preserve">  wifi_ssid = EyalSimulatorAP</w:t>
+        <w:t xml:space="preserve">  wifi_ssid = EyalSimulatorAP (advertised as a visible SoftAP by the ESP32-C3 bridge)</w:t>
       </w:r>
     </w:p>
     <w:p>

</xml_diff>

<commit_message>
Release v0.1.16 - move simulator transport ownership toward bridge
</commit_message>
<xml_diff>
--- a/docs/EyalEspressoServerSimulatorDetailedDesign.docx
+++ b/docs/EyalEspressoServerSimulatorDetailedDesign.docx
@@ -14,12 +14,12 @@
     </w:p>
     <w:p>
       <w:r>
-        <w:t xml:space="preserve">Project Version Reference: 0.1.13</w:t>
-      </w:r>
-    </w:p>
-    <w:p>
-      <w:r>
-        <w:t xml:space="preserve">Reviewed on: 11-Mar-26 17:58:22</w:t>
+        <w:t xml:space="preserve">Project Version Reference: 0.1.15</w:t>
+      </w:r>
+    </w:p>
+    <w:p>
+      <w:r>
+        <w:t xml:space="preserve">Reviewed on: 12-Mar-26 21:05:26</w:t>
       </w:r>
     </w:p>
     <w:p>
@@ -50,7 +50,7 @@
     </w:p>
     <w:p>
       <w:r>
-        <w:t xml:space="preserve">Architecture Decision: the PC remains the simulator brain, operator UI, scenario engine, and authoritative host-side liveness source. The ESP32-C3 remains a transport bridge plus low-level watchdog and CRC controller.</w:t>
+        <w:t xml:space="preserve">Architecture Decision: the PC remains the simulator brain, operator UI, scenario engine, and supervisory control surface. The ESP32-C3 remains the authoritative low-level transport controller, including live-integer ownership, keepalive/watchdog enforcement, and CRC validation.</w:t>
       </w:r>
     </w:p>
     <w:p>
@@ -140,17 +140,32 @@
     </w:p>
     <w:p>
       <w:r>
-        <w:t xml:space="preserve">  - authoritative HostLiveInteger generation</w:t>
-      </w:r>
-    </w:p>
-    <w:p>
-      <w:r>
         <w:t xml:space="preserve">  - framing and interpretation of low-level commands sent to the ESP32-C3</w:t>
       </w:r>
     </w:p>
     <w:p>
       <w:r>
-        <w:t xml:space="preserve">  - reset and initialize policy decisions after failures</w:t>
+        <w:t xml:space="preserve">  - mirrored state presentation, logging, and operator controls</w:t>
+      </w:r>
+    </w:p>
+    <w:p>
+      <w:r>
+        <w:t xml:space="preserve">  - COM-port ownership, forced COM release, and USB session lifetime control</w:t>
+      </w:r>
+    </w:p>
+    <w:p>
+      <w:r>
+        <w:t xml:space="preserve">  - mirrored configuration validation before INITIALIZE is sent</w:t>
+      </w:r>
+    </w:p>
+    <w:p>
+      <w:r>
+        <w:t xml:space="preserve">  - reset and initialize policy decisions after failures reported by the bridge</w:t>
+      </w:r>
+    </w:p>
+    <w:p>
+      <w:r>
+        <w:t xml:space="preserve">  - sequential keepalive-failure counting and ConnectionFault latching into wait_for_com_reset</w:t>
       </w:r>
     </w:p>
     <w:p>
@@ -180,7 +195,17 @@
     </w:p>
     <w:p>
       <w:r>
-        <w:t xml:space="preserve">  - maintain the low-level state machine: reset, initialize, connect, keepalive/send-data supervision, error</w:t>
+        <w:t xml:space="preserve">  - maintain the low-level state machine: reset, initialize, connect, keepalive, and bridge fault reporting</w:t>
+      </w:r>
+    </w:p>
+    <w:p>
+      <w:r>
+        <w:t xml:space="preserve">  - own ServerLiveInteger and ClientLiveInteger during the active session</w:t>
+      </w:r>
+    </w:p>
+    <w:p>
+      <w:r>
+        <w:t xml:space="preserve">  - zero both counters every time connect is entered</w:t>
       </w:r>
     </w:p>
     <w:p>
@@ -231,7 +256,7 @@
     </w:p>
     <w:p>
       <w:r>
-        <w:t xml:space="preserve">  - server/sim/link_state_machine.py = current low-level simulator runtime owner</w:t>
+        <w:t xml:space="preserve">  - server/sim/link_state_machine.py = current host-side mirror of authoritative bridge state</w:t>
       </w:r>
     </w:p>
     <w:p>
@@ -271,12 +296,7 @@
     </w:p>
     <w:p>
       <w:r>
-        <w:t xml:space="preserve">  - send_data</w:t>
-      </w:r>
-    </w:p>
-    <w:p>
-      <w:r>
-        <w:t xml:space="preserve">  - error</w:t>
+        <w:t xml:space="preserve">  - wait_for_com_reset</w:t>
       </w:r>
     </w:p>
     <w:p>
@@ -306,7 +326,17 @@
     </w:p>
     <w:p>
       <w:r>
-        <w:t xml:space="preserve">  - LinkRuntime.reset() = clear counters and watchdog state, send RESET, and arm automatic initialize progression</w:t>
+        <w:t xml:space="preserve">  - LinkRuntime.force_release_transport() = hard COM-port release helper for likely external holders</w:t>
+      </w:r>
+    </w:p>
+    <w:p>
+      <w:r>
+        <w:t xml:space="preserve">  - LinkRuntime.toggle_wifi_enabled() = operator test hook for bridge SoftAP availability</w:t>
+      </w:r>
+    </w:p>
+    <w:p>
+      <w:r>
+        <w:t xml:space="preserve">  - LinkRuntime.reset() = clear mirrored host state, send RESET, and arm automatic initialize progression</w:t>
       </w:r>
     </w:p>
     <w:p>
@@ -316,12 +346,12 @@
     </w:p>
     <w:p>
       <w:r>
-        <w:t xml:space="preserve">  - LinkRuntime.send_keepalive() = increment HostLiveInteger, transmit KEEPALIVE, and supervise the active session</w:t>
-      </w:r>
-    </w:p>
-    <w:p>
-      <w:r>
-        <w:t xml:space="preserve">  - LinkRuntime.send_data() = transmit DATA only after connect success enables payload traffic</w:t>
+        <w:t xml:space="preserve">  - LinkRuntime.send_keepalive() = monitor-only API that reports bridge-owned keepalive state</w:t>
+      </w:r>
+    </w:p>
+    <w:p>
+      <w:r>
+        <w:t xml:space="preserve">  - LinkRuntime.send_data() = transmit DATA only after the bridge has reported keepalive-ready state</w:t>
       </w:r>
     </w:p>
     <w:p>
@@ -382,12 +412,7 @@
     </w:p>
     <w:p>
       <w:r>
-        <w:t xml:space="preserve">  - BRIDGE_STATE_DISCONNECT</w:t>
-      </w:r>
-    </w:p>
-    <w:p>
-      <w:r>
-        <w:t xml:space="preserve">  - BRIDGE_STATE_ERROR</w:t>
+        <w:t xml:space="preserve">Implementation Note: the current firmware source still carries legacy internal bridge enums such as BRIDGE_STATE_DISCONNECT and BRIDGE_STATE_ERROR, but the active host-visible transport contract is reset -&gt; initialize -&gt; connect -&gt; keepalive with wait_for_com_reset handled by the Python supervisor.</w:t>
       </w:r>
     </w:p>
     <w:p>
@@ -442,7 +467,7 @@
     </w:p>
     <w:p>
       <w:r>
-        <w:t xml:space="preserve">  - app_main() = USB-Serial/JTAG polling loop that reads frames and dispatches them</w:t>
+        <w:t xml:space="preserve">  - app_main() = USB-Serial/JTAG polling loop that reads frames, services TCP transport, and enforces the bridge watchdog</w:t>
       </w:r>
     </w:p>
     <w:p>
@@ -467,6 +492,11 @@
     </w:p>
     <w:p>
       <w:r>
+        <w:t xml:space="preserve">  - bridge_service_transport_watchdog() = authoritative keepalive supervision and stale-session teardown on the bridge</w:t>
+      </w:r>
+    </w:p>
+    <w:p>
+      <w:r>
         <w:t xml:space="preserve">  - bridge_crc16_ccitt() = shared integrity algorithm used for bridge-side frame validation and emission</w:t>
       </w:r>
     </w:p>
@@ -477,7 +507,7 @@
     </w:p>
     <w:p>
       <w:r>
-        <w:t xml:space="preserve">  - the ESP32-C3 firmware baseline currently acknowledges low-level framed traffic and state changes, but it does not yet implement the full real Wi-Fi/TCP forwarding path expected from the final transport-controller design</w:t>
+        <w:t xml:space="preserve">  - the ESP32-C3 firmware is now the low-level transport authority, but higher-level simulator scenarios and UI orchestration still live on the PC host</w:t>
       </w:r>
     </w:p>
     <w:p/>
@@ -518,12 +548,7 @@
     </w:p>
     <w:p>
       <w:r>
-        <w:t xml:space="preserve">  send_data</w:t>
-      </w:r>
-    </w:p>
-    <w:p>
-      <w:r>
-        <w:t xml:space="preserve">  error</w:t>
+        <w:t xml:space="preserve">  wait_for_com_reset</w:t>
       </w:r>
     </w:p>
     <w:p>
@@ -543,22 +568,17 @@
     </w:p>
     <w:p>
       <w:r>
-        <w:t xml:space="preserve">  connect = wait for the ESP controller connect response</w:t>
-      </w:r>
-    </w:p>
-    <w:p>
-      <w:r>
-        <w:t xml:space="preserve">  keepalive = active low-level supervision after connect success</w:t>
-      </w:r>
-    </w:p>
-    <w:p>
-      <w:r>
-        <w:t xml:space="preserve">  send_data = active payload state that remains allowed only while keepalive supervision is healthy</w:t>
-      </w:r>
-    </w:p>
-    <w:p>
-      <w:r>
-        <w:t xml:space="preserve">  error = latch fault state and wait only for reset</w:t>
+        <w:t xml:space="preserve">  connect = wait for the ESP32-C3 bridge to report explicit client-connected or keepalive traffic</w:t>
+      </w:r>
+    </w:p>
+    <w:p>
+      <w:r>
+        <w:t xml:space="preserve">  keepalive = active low-level supervision owned by the ESP32-C3 bridge after connect success</w:t>
+      </w:r>
+    </w:p>
+    <w:p>
+      <w:r>
+        <w:t xml:space="preserve">  wait_for_com_reset = host-side latch that waits for explicit Reset Communication after repeated bridge-reported keepalive faults</w:t>
       </w:r>
     </w:p>
     <w:p>
@@ -568,37 +588,22 @@
     </w:p>
     <w:p>
       <w:r>
-        <w:t xml:space="preserve">  reset -&gt; initialize -&gt; connect -&gt; keepalive -&gt; send_data</w:t>
-      </w:r>
-    </w:p>
-    <w:p>
-      <w:r>
-        <w:t xml:space="preserve">  send_data -&gt; keepalive when keepalive is explicitly resumed</w:t>
-      </w:r>
-    </w:p>
-    <w:p>
-      <w:r>
-        <w:t xml:space="preserve">  connect -&gt; error</w:t>
-      </w:r>
-    </w:p>
-    <w:p>
-      <w:r>
-        <w:t xml:space="preserve">  initialize -&gt; error</w:t>
-      </w:r>
-    </w:p>
-    <w:p>
-      <w:r>
-        <w:t xml:space="preserve">  keepalive -&gt; error when supervision fails</w:t>
-      </w:r>
-    </w:p>
-    <w:p>
-      <w:r>
-        <w:t xml:space="preserve">  send_data -&gt; error when supervision fails</w:t>
-      </w:r>
-    </w:p>
-    <w:p>
-      <w:r>
-        <w:t xml:space="preserve">  error -&gt; reset</w:t>
+        <w:t xml:space="preserve">  reset -&gt; initialize -&gt; connect -&gt; keepalive</w:t>
+      </w:r>
+    </w:p>
+    <w:p>
+      <w:r>
+        <w:t xml:space="preserve">  keepalive -&gt; connect when the bridge reports transport loss</w:t>
+      </w:r>
+    </w:p>
+    <w:p>
+      <w:r>
+        <w:t xml:space="preserve">  keepalive -&gt; wait_for_com_reset after 5 sequential bridge-reported keepalive failures</w:t>
+      </w:r>
+    </w:p>
+    <w:p>
+      <w:r>
+        <w:t xml:space="preserve">  wait_for_com_reset -&gt; reset</w:t>
       </w:r>
     </w:p>
     <w:p>
@@ -609,7 +614,7 @@
         <w:rPr>
           <w:i/>
         </w:rPr>
-        <w:t xml:space="preserve">Figure 2. Mirrored low-level transport state machine used by the simulator host, ESP32-C3 bridge, and client.</w:t>
+        <w:t xml:space="preserve">Figure 2. Host-visible low-level transport state machine, with bridge-side timing ownership.</w:t>
       </w:r>
     </w:p>
     <w:p>
@@ -672,12 +677,17 @@
     </w:p>
     <w:p>
       <w:r>
-        <w:t xml:space="preserve">  - connect shall not forward application data upward until the keep-alive exchange is healthy</w:t>
-      </w:r>
-    </w:p>
-    <w:p>
-      <w:r>
-        <w:t xml:space="preserve">  - error shall freeze normal forwarding and preserve the last error reason for the PC host</w:t>
+        <w:t xml:space="preserve">  - connect shall zero both live integers at the bridge before the first keepalive of a new session</w:t>
+      </w:r>
+    </w:p>
+    <w:p>
+      <w:r>
+        <w:t xml:space="preserve">  - the Python host shall not derive transport watchdog failures from browser snapshot timing</w:t>
+      </w:r>
+    </w:p>
+    <w:p>
+      <w:r>
+        <w:t xml:space="preserve">  - keepalive shall not forward application data upward until the bridge reports a healthy exchange</w:t>
       </w:r>
     </w:p>
     <w:p/>
@@ -824,7 +834,7 @@
     </w:p>
     <w:p>
       <w:r>
-        <w:t xml:space="preserve">Liveness Recommendation: HostLiveInteger should be authoritative from the PC host because the main purpose is to prove that the upper-level simulator process is not stalled. The ESP32-C3 should return its own DeviceLiveInteger so liveness can be verified in both directions.</w:t>
+        <w:t xml:space="preserve">Liveness Recommendation: ServerLiveInteger and ClientLiveInteger are authoritative from the ESP32-C3 bridge/client transport exchange. The Python simulator host mirrors those values and does not invent them.</w:t>
       </w:r>
     </w:p>
     <w:p/>
@@ -846,11 +856,6 @@
     <w:p>
       <w:r>
         <w:t xml:space="preserve">CONNECT packet: requests active connection establishment or active-session entry.</w:t>
-      </w:r>
-    </w:p>
-    <w:p>
-      <w:r>
-        <w:t xml:space="preserve">DISCONNECT packet: requests controlled teardown.</w:t>
       </w:r>
     </w:p>
     <w:p>
@@ -1056,7 +1061,7 @@
     </w:p>
     <w:p>
       <w:r>
-        <w:t xml:space="preserve">  ESP32-C3 -&gt; establish Wi-Fi-ready state and attempt TCP session</w:t>
+        <w:t xml:space="preserve">  ESP32-C3 -&gt; zero ServerLiveInteger and ClientLiveInteger and establish Wi-Fi-ready state</w:t>
       </w:r>
     </w:p>
     <w:p>
@@ -1066,7 +1071,7 @@
     </w:p>
     <w:p>
       <w:r>
-        <w:t xml:space="preserve">  PC Host and ESP32-C3 -&gt; begin periodic keep-alive supervision</w:t>
+        <w:t xml:space="preserve">  ESP32-C3 -&gt; if a TCP client is already present, immediately mirror client_connected and the first KEEPALIVE</w:t>
       </w:r>
     </w:p>
     <w:p>
@@ -1131,27 +1136,27 @@
     </w:p>
     <w:p>
       <w:r>
-        <w:t xml:space="preserve">  Every 100 mSec PC Host -&gt; KEEPALIVE(host_live_integer incremented)</w:t>
-      </w:r>
-    </w:p>
-    <w:p>
-      <w:r>
-        <w:t xml:space="preserve">  ESP32-C3 -&gt; verify host counter advanced within 100 mSec window</w:t>
-      </w:r>
-    </w:p>
-    <w:p>
-      <w:r>
-        <w:t xml:space="preserve">  ESP32-C3 -&gt; KEEPALIVE_ACK(device_live_integer, link health, transport status)</w:t>
-      </w:r>
-    </w:p>
-    <w:p>
-      <w:r>
-        <w:t xml:space="preserve">  PC Host -&gt; verify response timing and device counter progress</w:t>
-      </w:r>
-    </w:p>
-    <w:p>
-      <w:r>
-        <w:t xml:space="preserve">  If expected progress is missing -&gt; both sides transition to error</w:t>
+        <w:t xml:space="preserve">  Every 100 mSec ESP32-C3 -&gt; KEEPALIVE(ServerLiveInteger, ClientLiveInteger)</w:t>
+      </w:r>
+    </w:p>
+    <w:p>
+      <w:r>
+        <w:t xml:space="preserve">  ESP32-S3 client -&gt; validate ServerLiveInteger and increment ClientLiveInteger</w:t>
+      </w:r>
+    </w:p>
+    <w:p>
+      <w:r>
+        <w:t xml:space="preserve">  ESP32-S3 client -&gt; KEEPALIVE(ClientLiveInteger incremented)</w:t>
+      </w:r>
+    </w:p>
+    <w:p>
+      <w:r>
+        <w:t xml:space="preserve">  ESP32-C3 -&gt; verify the returned ClientLiveInteger and advance ServerLiveInteger</w:t>
+      </w:r>
+    </w:p>
+    <w:p>
+      <w:r>
+        <w:t xml:space="preserve">  Python simulator host -&gt; mirror the authoritative bridge counters over USB</w:t>
       </w:r>
     </w:p>
     <w:p>
@@ -1162,7 +1167,7 @@
         <w:rPr>
           <w:i/>
         </w:rPr>
-        <w:t xml:space="preserve">Figure 6. Simulator KEEPALIVE packet flow with host-owned liveness and bridge status acknowledgement.</w:t>
+        <w:t xml:space="preserve">Figure 6. Simulator KEEPALIVE packet flow with bridge-owned liveness and host-side mirroring.</w:t>
       </w:r>
     </w:p>
     <w:p>
@@ -1301,7 +1306,7 @@
     </w:p>
     <w:p>
       <w:r>
-        <w:t xml:space="preserve">  ESP32-C3 or client low-level layer detects fault</w:t>
+        <w:t xml:space="preserve">  ESP32-C3 bridge or client low-level layer detects fault</w:t>
       </w:r>
     </w:p>
     <w:p>
@@ -1311,12 +1316,12 @@
     </w:p>
     <w:p>
       <w:r>
-        <w:t xml:space="preserve">  Receiving side -&gt; stop trusting link health and enter supervisory recovery</w:t>
-      </w:r>
-    </w:p>
-    <w:p>
-      <w:r>
-        <w:t xml:space="preserve">  Recovery command must be reset</w:t>
+        <w:t xml:space="preserve">  Python host -&gt; retry through connect for bridge-reported keepalive loss or latch wait_for_com_reset for blocking COM/runtime faults</w:t>
+      </w:r>
+    </w:p>
+    <w:p>
+      <w:r>
+        <w:t xml:space="preserve">  Recovery command must be reset once wait_for_com_reset is reached</w:t>
       </w:r>
     </w:p>
     <w:p>
@@ -1386,17 +1391,17 @@
     </w:p>
     <w:p>
       <w:r>
-        <w:t xml:space="preserve">Failure Trigger: if a message was not responded to with the expected liveness progress within 100 mSec, the low-level controller shall move to error.</w:t>
-      </w:r>
-    </w:p>
-    <w:p>
-      <w:r>
-        <w:t xml:space="preserve">Host Ownership Rule: the host-side simulator shall increment HostLiveInteger. This is preferable because it proves the upper-level PC application is still making forward progress.</w:t>
-      </w:r>
-    </w:p>
-    <w:p>
-      <w:r>
-        <w:t xml:space="preserve">Device Visibility Rule: the ESP32-C3 should also increment DeviceLiveInteger in responses so the PC can independently detect bridge-side stalls.</w:t>
+        <w:t xml:space="preserve">Failure Trigger: if the ESP32-C3 bridge does not receive the expected client keepalive progress within the watchdog window, it shall report keepalive_supervision_lost upstream and close the stale TCP session.</w:t>
+      </w:r>
+    </w:p>
+    <w:p>
+      <w:r>
+        <w:t xml:space="preserve">Counter Ownership Rule: the bridge zeros both counters when connect begins, then ServerLiveInteger starts on the bridge side and ClientLiveInteger advances only after the client validates the received server value.</w:t>
+      </w:r>
+    </w:p>
+    <w:p>
+      <w:r>
+        <w:t xml:space="preserve">Host Visibility Rule: the Python simulator host mirrors bridge-reported counters and faults; it does not derive keepalive loss from UI polling cadence.</w:t>
       </w:r>
     </w:p>
     <w:p>
@@ -1412,7 +1417,7 @@
     </w:p>
     <w:p>
       <w:r>
-        <w:t xml:space="preserve">A low-level transport fault shall always force a transition into the shared error state before higher-level simulator logic consumes any additional payload.</w:t>
+        <w:t xml:space="preserve">A low-level transport fault shall be detected first by the ESP32-C3 bridge when it relates to the active TCP keepalive session. The Python host mirrors those faults and applies operator recovery policy.</w:t>
       </w:r>
     </w:p>
     <w:p>
@@ -1423,7 +1428,7 @@
         <w:rPr>
           <w:i/>
         </w:rPr>
-        <w:t xml:space="preserve">Figure 9. Simulator failure overview spanning CRC faults, watchdog failures, COM faults, Wi-Fi faults, and TCP session loss.</w:t>
+        <w:t xml:space="preserve">Figure 9. Simulator failure overview showing bridge-owned transport detection and host-side recovery policy.</w:t>
       </w:r>
     </w:p>
     <w:p>
@@ -1486,7 +1491,7 @@
     </w:p>
     <w:p>
       <w:r>
-        <w:t xml:space="preserve">  connect -&gt; receive invalid CRC -&gt; error</w:t>
+        <w:t xml:space="preserve">  connect or keepalive -&gt; receive invalid CRC -&gt; reject frame and retry transport progression</w:t>
       </w:r>
     </w:p>
     <w:p>
@@ -1496,18 +1501,18 @@
     </w:p>
     <w:p>
       <w:r>
-        <w:t xml:space="preserve">  error -&gt; reset</w:t>
-      </w:r>
-    </w:p>
-    <w:p/>
-    <w:p>
-      <w:r>
-        <w:t xml:space="preserve">8.2 Host Watchdog Failure</w:t>
-      </w:r>
-    </w:p>
-    <w:p>
-      <w:r>
-        <w:t xml:space="preserve">Description: HostLiveInteger stops advancing, indicating the PC simulator may be stalled.</w:t>
+        <w:t xml:space="preserve">  automatic retry through connect, then explicit reset after threshold if required</w:t>
+      </w:r>
+    </w:p>
+    <w:p/>
+    <w:p>
+      <w:r>
+        <w:t xml:space="preserve">8.2 Bridge Keepalive Watchdog Failure</w:t>
+      </w:r>
+    </w:p>
+    <w:p>
+      <w:r>
+        <w:t xml:space="preserve">Description: the ESP32-C3 bridge does not receive the expected client keepalive progression within the watchdog window.</w:t>
       </w:r>
     </w:p>
     <w:p>
@@ -1517,7 +1522,7 @@
     </w:p>
     <w:p>
       <w:r>
-        <w:t xml:space="preserve">  connect -&gt; keepalive timeout without host counter progress -&gt; error</w:t>
+        <w:t xml:space="preserve">  keepalive -&gt; bridge watchdog timeout -&gt; host retry through connect</w:t>
       </w:r>
     </w:p>
     <w:p>
@@ -1527,18 +1532,18 @@
     </w:p>
     <w:p>
       <w:r>
-        <w:t xml:space="preserve">  error -&gt; reset after host recovers</w:t>
-      </w:r>
-    </w:p>
-    <w:p/>
-    <w:p>
-      <w:r>
-        <w:t xml:space="preserve">8.3 Device Watchdog Failure</w:t>
-      </w:r>
-    </w:p>
-    <w:p>
-      <w:r>
-        <w:t xml:space="preserve">Description: ESP32-C3 does not provide the expected keep-alive acknowledgement or DeviceLiveInteger progress.</w:t>
+        <w:t xml:space="preserve">  repeated bridge watchdog failures -&gt; wait_for_com_reset -&gt; reset after operator action</w:t>
+      </w:r>
+    </w:p>
+    <w:p/>
+    <w:p>
+      <w:r>
+        <w:t xml:space="preserve">8.3 Device-Side Keepalive Failure</w:t>
+      </w:r>
+    </w:p>
+    <w:p>
+      <w:r>
+        <w:t xml:space="preserve">Description: the ESP32-S3 client does not provide the expected ClientLiveInteger progression.</w:t>
       </w:r>
     </w:p>
     <w:p>
@@ -1548,7 +1553,7 @@
     </w:p>
     <w:p>
       <w:r>
-        <w:t xml:space="preserve">  keepalive -&gt; expected keepalive ack missing -&gt; error</w:t>
+        <w:t xml:space="preserve">  keepalive -&gt; bridge observes missing client forward progress -&gt; bridge reports keepalive_supervision_lost -&gt; host retry through connect</w:t>
       </w:r>
     </w:p>
     <w:p>
@@ -1558,7 +1563,7 @@
     </w:p>
     <w:p>
       <w:r>
-        <w:t xml:space="preserve">  error -&gt; reset</w:t>
+        <w:t xml:space="preserve">  automatic retry until threshold, then wait_for_com_reset -&gt; reset</w:t>
       </w:r>
     </w:p>
     <w:p/>
@@ -1579,7 +1584,7 @@
     </w:p>
     <w:p>
       <w:r>
-        <w:t xml:space="preserve">  reset/initialize/connect -&gt; COM failure -&gt; error</w:t>
+        <w:t xml:space="preserve">  reset/initialize/connect/keepalive -&gt; COM failure -&gt; wait_for_com_reset</w:t>
       </w:r>
     </w:p>
     <w:p>
@@ -1589,7 +1594,7 @@
     </w:p>
     <w:p>
       <w:r>
-        <w:t xml:space="preserve">  error -&gt; wait for COM recovery -&gt; reset</w:t>
+        <w:t xml:space="preserve">  restore COM availability -&gt; reset</w:t>
       </w:r>
     </w:p>
     <w:p/>
@@ -1615,7 +1620,7 @@
     </w:p>
     <w:p>
       <w:r>
-        <w:t xml:space="preserve">  open or initialize -&gt; COM port unavailable -&gt; error</w:t>
+        <w:t xml:space="preserve">  open or initialize -&gt; COM port unavailable -&gt; wait_for_com_reset</w:t>
       </w:r>
     </w:p>
     <w:p>
@@ -1625,7 +1630,7 @@
     </w:p>
     <w:p>
       <w:r>
-        <w:t xml:space="preserve">  error -&gt; restore COM availability -&gt; reset</w:t>
+        <w:t xml:space="preserve">  restore COM availability -&gt; reset</w:t>
       </w:r>
     </w:p>
     <w:p/>
@@ -1636,7 +1641,7 @@
     </w:p>
     <w:p>
       <w:r>
-        <w:t xml:space="preserve">Description: ESP32-C3 cannot join the target Wi-Fi network.</w:t>
+        <w:t xml:space="preserve">Description: the bridge-side connect path cannot establish the required Wi-Fi/TCP transport preconditions.</w:t>
       </w:r>
     </w:p>
     <w:p>
@@ -1646,7 +1651,7 @@
     </w:p>
     <w:p>
       <w:r>
-        <w:t xml:space="preserve">  initialize -&gt; Wi-Fi association failure -&gt; error</w:t>
+        <w:t xml:space="preserve">  initialize or connect -&gt; bridge-side Wi-Fi/TCP failure -&gt; retry through connect</w:t>
       </w:r>
     </w:p>
     <w:p>
@@ -1656,7 +1661,7 @@
     </w:p>
     <w:p>
       <w:r>
-        <w:t xml:space="preserve">  error -&gt; initialize with corrected parameters or reset</w:t>
+        <w:t xml:space="preserve">  automatic retry or explicit reset after operator action</w:t>
       </w:r>
     </w:p>
     <w:p/>
@@ -1682,7 +1687,7 @@
     </w:p>
     <w:p>
       <w:r>
-        <w:t xml:space="preserve">  initialize -&gt; validate mirrored Wi-Fi config -&gt; AP unavailable -&gt; error</w:t>
+        <w:t xml:space="preserve">  initialize -&gt; validate mirrored Wi-Fi config -&gt; AP unavailable -&gt; wait_for_com_reset</w:t>
       </w:r>
     </w:p>
     <w:p>
@@ -1692,7 +1697,7 @@
     </w:p>
     <w:p>
       <w:r>
-        <w:t xml:space="preserve">  error -&gt; correct RF environment or Wi-Fi configuration -&gt; reset -&gt; initialize</w:t>
+        <w:t xml:space="preserve">  correct RF environment or Wi-Fi configuration -&gt; reset -&gt; initialize</w:t>
       </w:r>
     </w:p>
     <w:p/>
@@ -1718,7 +1723,7 @@
     </w:p>
     <w:p>
       <w:r>
-        <w:t xml:space="preserve">  connect -&gt; TCP listener unavailable -&gt; error</w:t>
+        <w:t xml:space="preserve">  connect -&gt; TCP listener unavailable -&gt; retry through connect</w:t>
       </w:r>
     </w:p>
     <w:p>
@@ -1728,7 +1733,7 @@
     </w:p>
     <w:p>
       <w:r>
-        <w:t xml:space="preserve">  error -&gt; restore listener or correct endpoint -&gt; initialize -&gt; connect</w:t>
+        <w:t xml:space="preserve">  restore listener or correct endpoint -&gt; initialize -&gt; connect</w:t>
       </w:r>
     </w:p>
     <w:p/>
@@ -1754,7 +1759,7 @@
     </w:p>
     <w:p>
       <w:r>
-        <w:t xml:space="preserve">  initialize/connect -&gt; stage-specific failure without precise classification -&gt; error</w:t>
+        <w:t xml:space="preserve">  initialize/connect -&gt; stage-specific failure without precise classification -&gt; retry or wait_for_com_reset depending on the failing stage</w:t>
       </w:r>
     </w:p>
     <w:p>
@@ -1764,7 +1769,7 @@
     </w:p>
     <w:p>
       <w:r>
-        <w:t xml:space="preserve">  error -&gt; review stage detail -&gt; reset or initialize</w:t>
+        <w:t xml:space="preserve">  review stage detail -&gt; reset or initialize</w:t>
       </w:r>
     </w:p>
     <w:p/>
@@ -1785,7 +1790,7 @@
     </w:p>
     <w:p>
       <w:r>
-        <w:t xml:space="preserve">  connect -&gt; socket loss -&gt; error</w:t>
+        <w:t xml:space="preserve">  keepalive -&gt; socket loss -&gt; retry through connect</w:t>
       </w:r>
     </w:p>
     <w:p>
@@ -1795,7 +1800,7 @@
     </w:p>
     <w:p>
       <w:r>
-        <w:t xml:space="preserve">  error -&gt; initialize -&gt; connect</w:t>
+        <w:t xml:space="preserve">  initialize -&gt; connect</w:t>
       </w:r>
     </w:p>
     <w:p/>
@@ -1816,7 +1821,7 @@
     </w:p>
     <w:p>
       <w:r>
-        <w:t xml:space="preserve">  initialize/connect -&gt; parser reject -&gt; error</w:t>
+        <w:t xml:space="preserve">  initialize/connect/keepalive -&gt; parser reject -&gt; drop frame and retry transport progression</w:t>
       </w:r>
     </w:p>
     <w:p>
@@ -1826,7 +1831,7 @@
     </w:p>
     <w:p>
       <w:r>
-        <w:t xml:space="preserve">  error -&gt; reset after protocol review</w:t>
+        <w:t xml:space="preserve">  automatic retry or reset after protocol review</w:t>
       </w:r>
     </w:p>
     <w:p/>
@@ -1837,7 +1842,7 @@
     </w:p>
     <w:p>
       <w:r>
-        <w:t xml:space="preserve">Description: any latched low-level error may be cleared only by reset.</w:t>
+        <w:t xml:space="preserve">Description: any latched wait_for_com_reset condition may be cleared only by reset.</w:t>
       </w:r>
     </w:p>
     <w:p>
@@ -1847,7 +1852,7 @@
     </w:p>
     <w:p>
       <w:r>
-        <w:t xml:space="preserve">  error -&gt; reset -&gt; initialize -&gt; connect</w:t>
+        <w:t xml:space="preserve">  wait_for_com_reset -&gt; reset -&gt; initialize -&gt; connect</w:t>
       </w:r>
     </w:p>
     <w:p>
@@ -1969,12 +1974,12 @@
     </w:p>
     <w:p>
       <w:r>
-        <w:t xml:space="preserve">  - Application Version = 0.1.13 from repository root VERSION</w:t>
-      </w:r>
-    </w:p>
-    <w:p>
-      <w:r>
-        <w:t xml:space="preserve">  - Firmware Version = 0.1.12 from firmware/esp32c3_bridge/VERSION</w:t>
+        <w:t xml:space="preserve">  - Application Version = 0.1.15 from repository root VERSION</w:t>
+      </w:r>
+    </w:p>
+    <w:p>
+      <w:r>
+        <w:t xml:space="preserve">  - Firmware Version = 0.1.15 from firmware/esp32c3_bridge/VERSION</w:t>
       </w:r>
     </w:p>
     <w:p>

</xml_diff>

<commit_message>
release: 0.1.18 bridge telemetry alignment and simulator observability
</commit_message>
<xml_diff>
--- a/docs/EyalEspressoServerSimulatorDetailedDesign.docx
+++ b/docs/EyalEspressoServerSimulatorDetailedDesign.docx
@@ -14,12 +14,12 @@
     </w:p>
     <w:p>
       <w:r>
-        <w:t xml:space="preserve">Project Version Reference: 0.1.15</w:t>
-      </w:r>
-    </w:p>
-    <w:p>
-      <w:r>
-        <w:t xml:space="preserve">Reviewed on: 12-Mar-26 21:05:26</w:t>
+        <w:t xml:space="preserve">Project Version Reference: 0.1.16</w:t>
+      </w:r>
+    </w:p>
+    <w:p>
+      <w:r>
+        <w:t xml:space="preserve">Reviewed on: 15-Mar-26 17:56:35</w:t>
       </w:r>
     </w:p>
     <w:p>
@@ -271,7 +271,7 @@
     </w:p>
     <w:p>
       <w:r>
-        <w:t xml:space="preserve">Implemented Low-Level Server States:</w:t>
+        <w:t xml:space="preserve">Implemented TopLayer Server States:</w:t>
       </w:r>
     </w:p>
     <w:p>
@@ -296,7 +296,7 @@
     </w:p>
     <w:p>
       <w:r>
-        <w:t xml:space="preserve">  - wait_for_com_reset</w:t>
+        <w:t xml:space="preserve">  - error</w:t>
       </w:r>
     </w:p>
     <w:p>
@@ -412,7 +412,7 @@
     </w:p>
     <w:p>
       <w:r>
-        <w:t xml:space="preserve">Implementation Note: the current firmware source still carries legacy internal bridge enums such as BRIDGE_STATE_DISCONNECT and BRIDGE_STATE_ERROR, but the active host-visible transport contract is reset -&gt; initialize -&gt; connect -&gt; keepalive with wait_for_com_reset handled by the Python supervisor.</w:t>
+        <w:t xml:space="preserve">Implementation Note: the current firmware source still carries legacy internal bridge enums such as BRIDGE_STATE_DISCONNECT and BRIDGE_STATE_ERROR, but the active host-visible transport contract is now TopLayer reset -&gt; initialize -&gt; connect -&gt; keepalive -&gt; error with explicit reset recovery.</w:t>
       </w:r>
     </w:p>
     <w:p>
@@ -513,17 +513,17 @@
     <w:p/>
     <w:p>
       <w:r>
-        <w:t xml:space="preserve">3. Low-Level State Machine Definition</w:t>
-      </w:r>
-    </w:p>
-    <w:p>
-      <w:r>
-        <w:t xml:space="preserve">The lowest communication layer shall implement the same conceptual state model on all participating sides so failure handling is deterministic.</w:t>
-      </w:r>
-    </w:p>
-    <w:p>
-      <w:r>
-        <w:t xml:space="preserve">States:</w:t>
+        <w:t xml:space="preserve">3. Two-Layer State Machine Definition</w:t>
+      </w:r>
+    </w:p>
+    <w:p>
+      <w:r>
+        <w:t xml:space="preserve">The transport stack is split into BottomLayer reliability and TopLayer supervision so failure handling is deterministic.</w:t>
+      </w:r>
+    </w:p>
+    <w:p>
+      <w:r>
+        <w:t xml:space="preserve">TopLayer States:</w:t>
       </w:r>
     </w:p>
     <w:p>
@@ -548,37 +548,77 @@
     </w:p>
     <w:p>
       <w:r>
-        <w:t xml:space="preserve">  wait_for_com_reset</w:t>
-      </w:r>
-    </w:p>
-    <w:p>
-      <w:r>
-        <w:t xml:space="preserve">State Semantics:</w:t>
-      </w:r>
-    </w:p>
-    <w:p>
-      <w:r>
-        <w:t xml:space="preserve">  reset = hard reset, counter clear, buffer clear, ESP controller re-initialization, and automatic initialize arming</w:t>
-      </w:r>
-    </w:p>
-    <w:p>
-      <w:r>
-        <w:t xml:space="preserve">  initialize = load the ESP controller with mirrored Wi-Fi and server constants before automatic connect</w:t>
-      </w:r>
-    </w:p>
-    <w:p>
-      <w:r>
-        <w:t xml:space="preserve">  connect = wait for the ESP32-C3 bridge to report explicit client-connected or keepalive traffic</w:t>
-      </w:r>
-    </w:p>
-    <w:p>
-      <w:r>
-        <w:t xml:space="preserve">  keepalive = active low-level supervision owned by the ESP32-C3 bridge after connect success</w:t>
-      </w:r>
-    </w:p>
-    <w:p>
-      <w:r>
-        <w:t xml:space="preserve">  wait_for_com_reset = host-side latch that waits for explicit Reset Communication after repeated bridge-reported keepalive faults</w:t>
+        <w:t xml:space="preserve">  error</w:t>
+      </w:r>
+    </w:p>
+    <w:p>
+      <w:r>
+        <w:t xml:space="preserve">TopLayer State Semantics:</w:t>
+      </w:r>
+    </w:p>
+    <w:p>
+      <w:r>
+        <w:t xml:space="preserve">  reset = hard reset, zero all counters, clear buffers, and arm initialize</w:t>
+      </w:r>
+    </w:p>
+    <w:p>
+      <w:r>
+        <w:t xml:space="preserve">  initialize = load mirrored communication constants for both layers</w:t>
+      </w:r>
+    </w:p>
+    <w:p>
+      <w:r>
+        <w:t xml:space="preserve">  connect = BottomLayer establish + TopLayer sequential liveness counter phase</w:t>
+      </w:r>
+    </w:p>
+    <w:p>
+      <w:r>
+        <w:t xml:space="preserve">  keepalive = active low-level supervision and serialized data traffic</w:t>
+      </w:r>
+    </w:p>
+    <w:p>
+      <w:r>
+        <w:t xml:space="preserve">  error = blocking fault state; explicit reset is required before reconnect</w:t>
+      </w:r>
+    </w:p>
+    <w:p>
+      <w:r>
+        <w:t xml:space="preserve">BottomLayer Rules:</w:t>
+      </w:r>
+    </w:p>
+    <w:p>
+      <w:r>
+        <w:t xml:space="preserve">  BottomLayer uses standard Wi-Fi/TCP auto-connect best practice with checksum validation and up to 3 retries</w:t>
+      </w:r>
+    </w:p>
+    <w:p>
+      <w:r>
+        <w:t xml:space="preserve">  BottomLayer retry triggers include link loss, reconnect failure, and checksum validation failure</w:t>
+      </w:r>
+    </w:p>
+    <w:p>
+      <w:r>
+        <w:t xml:space="preserve">TopLayer Rules:</w:t>
+      </w:r>
+    </w:p>
+    <w:p>
+      <w:r>
+        <w:t xml:space="preserve">  TopLayer detects sequential-communication loss and async freeze/watchdog faults</w:t>
+      </w:r>
+    </w:p>
+    <w:p>
+      <w:r>
+        <w:t xml:space="preserve">  TopLayer enters error if BottomLayer retry count reaches 3 OR TopLayer failure count reaches 3</w:t>
+      </w:r>
+    </w:p>
+    <w:p>
+      <w:r>
+        <w:t xml:space="preserve">Connect-to-KeepAlive Rule:</w:t>
+      </w:r>
+    </w:p>
+    <w:p>
+      <w:r>
+        <w:t xml:space="preserve">  both sides must complete 3 sequential live exchanges in connect before entering keepalive</w:t>
       </w:r>
     </w:p>
     <w:p>
@@ -593,17 +633,22 @@
     </w:p>
     <w:p>
       <w:r>
-        <w:t xml:space="preserve">  keepalive -&gt; connect when the bridge reports transport loss</w:t>
-      </w:r>
-    </w:p>
-    <w:p>
-      <w:r>
-        <w:t xml:space="preserve">  keepalive -&gt; wait_for_com_reset after 5 sequential bridge-reported keepalive failures</w:t>
-      </w:r>
-    </w:p>
-    <w:p>
-      <w:r>
-        <w:t xml:space="preserve">  wait_for_com_reset -&gt; reset</w:t>
+        <w:t xml:space="preserve">  connect -&gt; error on BottomLayerRetries==3 OR TopLayerFailures==3</w:t>
+      </w:r>
+    </w:p>
+    <w:p>
+      <w:r>
+        <w:t xml:space="preserve">  keepalive -&gt; error on async freeze or sequential communication loss</w:t>
+      </w:r>
+    </w:p>
+    <w:p>
+      <w:r>
+        <w:t xml:space="preserve">  error -&gt; reset only by explicit Reset Communication</w:t>
+      </w:r>
+    </w:p>
+    <w:p>
+      <w:r>
+        <w:t xml:space="preserve">Design Diagram Source: docs/architecture/top_bottom_layer_state_machine.mmd</w:t>
       </w:r>
     </w:p>
     <w:p>
@@ -1974,7 +2019,7 @@
     </w:p>
     <w:p>
       <w:r>
-        <w:t xml:space="preserve">  - Application Version = 0.1.15 from repository root VERSION</w:t>
+        <w:t xml:space="preserve">  - Application Version = 0.1.16 from repository root VERSION</w:t>
       </w:r>
     </w:p>
     <w:p>

</xml_diff>

<commit_message>
docs: update detailed design for v0.2.1 - owner Claude, revision history, DATA frame layout
Co-Authored-By: Claude Sonnet 4.6 <noreply@anthropic.com>
</commit_message>
<xml_diff>
--- a/docs/EyalEspressoServerSimulatorDetailedDesign.docx
+++ b/docs/EyalEspressoServerSimulatorDetailedDesign.docx
@@ -14,17 +14,53 @@
     </w:p>
     <w:p>
       <w:r>
-        <w:t xml:space="preserve">Project Version Reference: 0.1.16</w:t>
-      </w:r>
-    </w:p>
-    <w:p>
-      <w:r>
-        <w:t xml:space="preserve">Reviewed on: 15-Mar-26 17:56:35</w:t>
-      </w:r>
-    </w:p>
-    <w:p>
-      <w:r>
-        <w:t xml:space="preserve">Owner: Eyal / Codex</w:t>
+        <w:t xml:space="preserve">Project Version Reference: 0.2.1</w:t>
+      </w:r>
+    </w:p>
+    <w:p>
+      <w:r>
+        <w:t xml:space="preserve">Reviewed on: 18-Mar-26 21:29:28</w:t>
+      </w:r>
+    </w:p>
+    <w:p>
+      <w:r>
+        <w:t xml:space="preserve">Owner: Eyal / Claude</w:t>
+      </w:r>
+    </w:p>
+    <w:p/>
+    <w:p>
+      <w:r>
+        <w:t xml:space="preserve">Revision History</w:t>
+      </w:r>
+    </w:p>
+    <w:p>
+      <w:r>
+        <w:t xml:space="preserve">v0.2.1 - First working version with CLAUDE</w:t>
+      </w:r>
+    </w:p>
+    <w:p>
+      <w:r>
+        <w:t xml:space="preserve">  - Bridge INITIALIZE handler verified: requires data_ver=1 in payload (BRIDGE_REALTIME_DATA_INTERFACE_VERSION = 1)</w:t>
+      </w:r>
+    </w:p>
+    <w:p>
+      <w:r>
+        <w:t xml:space="preserve">  - Bridge KEEPALIVE handler verified: requires rver=1 in client response payload</w:t>
+      </w:r>
+    </w:p>
+    <w:p>
+      <w:r>
+        <w:t xml:space="preserve">  - Bridge DATA frame confirmed: 170-byte binary payload (version u32 LE, sequence u32 LE, value_bytes u16 LE = 160, 20 x double temperatures)</w:t>
+      </w:r>
+    </w:p>
+    <w:p>
+      <w:r>
+        <w:t xml:space="preserve">  - BRIDGE_FRAME_MAX_PAYLOAD = 256; client raised COMMUNICATION_FRAME_MAX_PAYLOAD to match</w:t>
+      </w:r>
+    </w:p>
+    <w:p>
+      <w:r>
+        <w:t xml:space="preserve">  - Transport fully operational: RESET -&gt; INITIALIZE -&gt; CONNECT -&gt; KEEPALIVE cycle sustained continuously</w:t>
       </w:r>
     </w:p>
     <w:p/>
@@ -210,7 +246,7 @@
     </w:p>
     <w:p>
       <w:r>
-        <w:t xml:space="preserve">  - enforce the 100 mSec keep-alive and watchdog behavior</w:t>
+        <w:t xml:space="preserve">  - enforce the bridge keepalive cadence (default 300 mSec) with a 450 mSec response window and timeout-driven retries</w:t>
       </w:r>
     </w:p>
     <w:p>
@@ -291,7 +327,12 @@
     </w:p>
     <w:p>
       <w:r>
-        <w:t xml:space="preserve">  - keepalive</w:t>
+        <w:t xml:space="preserve">  - keepalive_server_send</w:t>
+      </w:r>
+    </w:p>
+    <w:p>
+      <w:r>
+        <w:t xml:space="preserve">  - keepalive_client_return</w:t>
       </w:r>
     </w:p>
     <w:p>
@@ -371,7 +412,7 @@
     </w:p>
     <w:p>
       <w:r>
-        <w:t xml:space="preserve">  - server/ui/index.html = browser operator dashboard that drives Screen 1, Screen 2, and Screen 3 through the API routes</w:t>
+        <w:t xml:space="preserve">  - server/ui/index.html = browser operator dashboard that drives Screen 1 through Screen 5, including telemetry and delay diagnostics, through the API routes</w:t>
       </w:r>
     </w:p>
     <w:p/>
@@ -412,7 +453,7 @@
     </w:p>
     <w:p>
       <w:r>
-        <w:t xml:space="preserve">Implementation Note: the current firmware source still carries legacy internal bridge enums such as BRIDGE_STATE_DISCONNECT and BRIDGE_STATE_ERROR, but the active host-visible transport contract is now TopLayer reset -&gt; initialize -&gt; connect -&gt; keepalive -&gt; error with explicit reset recovery.</w:t>
+        <w:t xml:space="preserve">Implementation Note: legacy bridge enums still exist internally, but the active host-visible transport contract is now TopLayer reset -&gt; initialize -&gt; connect -&gt; keepalive_server_send -&gt; keepalive_client_return_server_send &lt;-&gt; keepalive_client_return -&gt; error with explicit reset recovery.</w:t>
       </w:r>
     </w:p>
     <w:p>
@@ -543,7 +584,12 @@
     </w:p>
     <w:p>
       <w:r>
-        <w:t xml:space="preserve">  keepalive</w:t>
+        <w:t xml:space="preserve">  keepalive_server_send</w:t>
+      </w:r>
+    </w:p>
+    <w:p>
+      <w:r>
+        <w:t xml:space="preserve">  keepalive_client_return</w:t>
       </w:r>
     </w:p>
     <w:p>
@@ -568,12 +614,17 @@
     </w:p>
     <w:p>
       <w:r>
-        <w:t xml:space="preserve">  connect = BottomLayer establish + TopLayer sequential liveness counter phase</w:t>
-      </w:r>
-    </w:p>
-    <w:p>
-      <w:r>
-        <w:t xml:space="preserve">  keepalive = active low-level supervision and serialized data traffic</w:t>
+        <w:t xml:space="preserve">  connect = BottomLayer establish and wait for bridge-proven keepalive readiness</w:t>
+      </w:r>
+    </w:p>
+    <w:p>
+      <w:r>
+        <w:t xml:space="preserve">  keepalive_server_send = bridge sends one authoritative keepalive request and starts response timeout window</w:t>
+      </w:r>
+    </w:p>
+    <w:p>
+      <w:r>
+        <w:t xml:space="preserve">  keepalive_client_return = bridge validates one client return and advances to the next send cycle</w:t>
       </w:r>
     </w:p>
     <w:p>
@@ -618,7 +669,7 @@
     </w:p>
     <w:p>
       <w:r>
-        <w:t xml:space="preserve">  both sides must complete 3 sequential live exchanges in connect before entering keepalive</w:t>
+        <w:t xml:space="preserve">  connect completion moves to keepalive_server_send, then each cycle alternates keepalive_server_send and keepalive_client_return</w:t>
       </w:r>
     </w:p>
     <w:p>
@@ -628,7 +679,7 @@
     </w:p>
     <w:p>
       <w:r>
-        <w:t xml:space="preserve">  reset -&gt; initialize -&gt; connect -&gt; keepalive</w:t>
+        <w:t xml:space="preserve">  reset -&gt; initialize -&gt; connect -&gt; keepalive_server_send -&gt; keepalive_client_return</w:t>
       </w:r>
     </w:p>
     <w:p>
@@ -638,7 +689,7 @@
     </w:p>
     <w:p>
       <w:r>
-        <w:t xml:space="preserve">  keepalive -&gt; error on async freeze or sequential communication loss</w:t>
+        <w:t xml:space="preserve">  keepalive_server_send or keepalive_client_return -&gt; error on async freeze or sequential communication loss</w:t>
       </w:r>
     </w:p>
     <w:p>
@@ -1266,6 +1317,41 @@
     </w:p>
     <w:p>
       <w:r>
+        <w:t xml:space="preserve">  ESP32-C3 bridge sends binary DATA frames to client during keepalive states</w:t>
+      </w:r>
+    </w:p>
+    <w:p>
+      <w:r>
+        <w:t xml:space="preserve">  DATA Frame Binary Layout (170 bytes):</w:t>
+      </w:r>
+    </w:p>
+    <w:p>
+      <w:r>
+        <w:t xml:space="preserve">    bytes 0..3   = version u32 LE = BRIDGE_REALTIME_DATA_INTERFACE_VERSION (1)</w:t>
+      </w:r>
+    </w:p>
+    <w:p>
+      <w:r>
+        <w:t xml:space="preserve">    bytes 4..7   = data_sequence u32 LE (increments each frame)</w:t>
+      </w:r>
+    </w:p>
+    <w:p>
+      <w:r>
+        <w:t xml:space="preserve">    bytes 8..9   = value_bytes u16 LE = 160</w:t>
+      </w:r>
+    </w:p>
+    <w:p>
+      <w:r>
+        <w:t xml:space="preserve">    bytes 10..169 = 20 x double temperature channels (stub: 85.0 + index + sequence*0.01)</w:t>
+      </w:r>
+    </w:p>
+    <w:p>
+      <w:r>
+        <w:t xml:space="preserve">  BRIDGE_FRAME_MAX_PAYLOAD = 256; client COMMUNICATION_FRAME_MAX_PAYLOAD must be &gt;= 170 to accept DATA frames</w:t>
+      </w:r>
+    </w:p>
+    <w:p>
+      <w:r>
         <w:t xml:space="preserve">  PC Host simulator logic -&gt; DATA(application payload)</w:t>
       </w:r>
     </w:p>
@@ -2019,12 +2105,12 @@
     </w:p>
     <w:p>
       <w:r>
-        <w:t xml:space="preserve">  - Application Version = 0.1.16 from repository root VERSION</w:t>
-      </w:r>
-    </w:p>
-    <w:p>
-      <w:r>
-        <w:t xml:space="preserve">  - Firmware Version = 0.1.15 from firmware/esp32c3_bridge/VERSION</w:t>
+        <w:t xml:space="preserve">  - Application Version = 0.2.1 from repository root VERSION</w:t>
+      </w:r>
+    </w:p>
+    <w:p>
+      <w:r>
+        <w:t xml:space="preserve">  - Firmware Version = 0.1.19 from firmware/esp32c3_bridge/VERSION</w:t>
       </w:r>
     </w:p>
     <w:p>

</xml_diff>

<commit_message>
release: bump to 0.3.4 and commit all pending server changes
</commit_message>
<xml_diff>
--- a/docs/EyalEspressoServerSimulatorDetailedDesign.docx
+++ b/docs/EyalEspressoServerSimulatorDetailedDesign.docx
@@ -14,12 +14,12 @@
     </w:p>
     <w:p>
       <w:r>
-        <w:t xml:space="preserve">Project Version Reference: 0.2.1</w:t>
-      </w:r>
-    </w:p>
-    <w:p>
-      <w:r>
-        <w:t xml:space="preserve">Reviewed on: 18-Mar-26 21:29:28</w:t>
+        <w:t xml:space="preserve">Project Version Reference: 0.3.3</w:t>
+      </w:r>
+    </w:p>
+    <w:p>
+      <w:r>
+        <w:t xml:space="preserve">Reviewed on: 29-Mar-26 11:05:15</w:t>
       </w:r>
     </w:p>
     <w:p>
@@ -2105,12 +2105,12 @@
     </w:p>
     <w:p>
       <w:r>
-        <w:t xml:space="preserve">  - Application Version = 0.2.1 from repository root VERSION</w:t>
-      </w:r>
-    </w:p>
-    <w:p>
-      <w:r>
-        <w:t xml:space="preserve">  - Firmware Version = 0.1.19 from firmware/esp32c3_bridge/VERSION</w:t>
+        <w:t xml:space="preserve">  - Application Version = 0.3.3 from repository root VERSION</w:t>
+      </w:r>
+    </w:p>
+    <w:p>
+      <w:r>
+        <w:t xml:space="preserve">  - Firmware Version = 0.1.24 from firmware/esp32c3_bridge/VERSION</w:t>
       </w:r>
     </w:p>
     <w:p>
@@ -2659,6 +2659,842 @@
     <w:p>
       <w:r>
         <w:t xml:space="preserve">The packet and state diagrams above are meant to be reviewed as the source-of-truth baseline before firmware and client-side low-level code are expanded further.</w:t>
+      </w:r>
+    </w:p>
+    <w:p/>
+    <w:p>
+      <w:r>
+        <w:t xml:space="preserve">14. Protocol Contract and Handshake Design</w:t>
+      </w:r>
+    </w:p>
+    <w:p>
+      <w:r>
+        <w:t xml:space="preserve">Purpose: this chapter defines the generic LCD-controller transport protocol contract so both endpoints can negotiate capabilities and schema safely while keeping runtime packets compact.</w:t>
+      </w:r>
+    </w:p>
+    <w:p>
+      <w:r>
+        <w:t xml:space="preserve">Protocol Name: GLCP (Gaggia LCD-Controller Protocol).</w:t>
+      </w:r>
+    </w:p>
+    <w:p>
+      <w:r>
+        <w:t xml:space="preserve">Primary Scope: endpoint negotiation, frame integrity, schema compatibility, and deterministic handshake behavior for controller &lt;-&gt; user-side transport.</w:t>
+      </w:r>
+    </w:p>
+    <w:p/>
+    <w:p>
+      <w:r>
+        <w:t xml:space="preserve">14.1 Reference Patterns Used for This Chapter</w:t>
+      </w:r>
+    </w:p>
+    <w:p>
+      <w:r>
+        <w:t xml:space="preserve">Design pattern source A (TCP, RFC 9293): explicit state progression for connection setup and confirmation before data exchange.</w:t>
+      </w:r>
+    </w:p>
+    <w:p>
+      <w:r>
+        <w:t xml:space="preserve">Design pattern source B (QUIC, RFC 9000): version negotiation and explicit handling of unsupported versions before normal traffic is accepted.</w:t>
+      </w:r>
+    </w:p>
+    <w:p>
+      <w:r>
+        <w:t xml:space="preserve">Design pattern source C (gRPC over HTTP/2 protocol description): strict wire framing plus an explicit request/response sequencing contract and keepalive ping behavior.</w:t>
+      </w:r>
+    </w:p>
+    <w:p>
+      <w:r>
+        <w:t xml:space="preserve">Design pattern source D (Protocol Buffers compatibility guidance): preserve backward compatibility through additive fields, stable identifiers, and strict no-reuse rules for retired identifiers.</w:t>
+      </w:r>
+    </w:p>
+    <w:p/>
+    <w:p>
+      <w:r>
+        <w:t xml:space="preserve">14.2 Protocol Goals and Non-Goals</w:t>
+      </w:r>
+    </w:p>
+    <w:p>
+      <w:r>
+        <w:t xml:space="preserve">Goals:</w:t>
+      </w:r>
+    </w:p>
+    <w:p>
+      <w:r>
+        <w:t xml:space="preserve">  - deterministic startup negotiation with clear reject reasons</w:t>
+      </w:r>
+    </w:p>
+    <w:p>
+      <w:r>
+        <w:t xml:space="preserve">  - compatibility across independent build cycles via schema hash negotiation</w:t>
+      </w:r>
+    </w:p>
+    <w:p>
+      <w:r>
+        <w:t xml:space="preserve">  - strict frame integrity checks before payload parsing</w:t>
+      </w:r>
+    </w:p>
+    <w:p>
+      <w:r>
+        <w:t xml:space="preserve">  - compact data-plane packets after successful handshake</w:t>
+      </w:r>
+    </w:p>
+    <w:p>
+      <w:r>
+        <w:t xml:space="preserve">Non-Goals:</w:t>
+      </w:r>
+    </w:p>
+    <w:p>
+      <w:r>
+        <w:t xml:space="preserve">  - dynamic shipping of C headers over the wire</w:t>
+      </w:r>
+    </w:p>
+    <w:p>
+      <w:r>
+        <w:t xml:space="preserve">  - parser-side dependence on compiler packing/alignment rules</w:t>
+      </w:r>
+    </w:p>
+    <w:p>
+      <w:r>
+        <w:t xml:space="preserve">  - acceptance of unsupported major versions</w:t>
+      </w:r>
+    </w:p>
+    <w:p/>
+    <w:p>
+      <w:r>
+        <w:t xml:space="preserve">14.3 Wire Frame Contract (GLCP v1)</w:t>
+      </w:r>
+    </w:p>
+    <w:p>
+      <w:r>
+        <w:t xml:space="preserve">Field Layout (all integers little-endian):</w:t>
+      </w:r>
+    </w:p>
+    <w:p>
+      <w:r>
+        <w:t xml:space="preserve">  Offset | Size | Field | Notes</w:t>
+      </w:r>
+    </w:p>
+    <w:p>
+      <w:r>
+        <w:t xml:space="preserve">  0 | 2 | sof | fixed 0xA55A</w:t>
+      </w:r>
+    </w:p>
+    <w:p>
+      <w:r>
+        <w:t xml:space="preserve">  2 | 1 | major | protocol major version</w:t>
+      </w:r>
+    </w:p>
+    <w:p>
+      <w:r>
+        <w:t xml:space="preserve">  3 | 1 | minor | protocol minor version</w:t>
+      </w:r>
+    </w:p>
+    <w:p>
+      <w:r>
+        <w:t xml:space="preserve">  4 | 2 | msg_id | message identifier</w:t>
+      </w:r>
+    </w:p>
+    <w:p>
+      <w:r>
+        <w:t xml:space="preserve">  6 | 2 | flags | bitmask: ack_required, is_response, is_error</w:t>
+      </w:r>
+    </w:p>
+    <w:p>
+      <w:r>
+        <w:t xml:space="preserve">  8 | 4 | session_id | selected by server/bridge after handshake</w:t>
+      </w:r>
+    </w:p>
+    <w:p>
+      <w:r>
+        <w:t xml:space="preserve">  12 | 4 | seq | monotonic sequence in active session</w:t>
+      </w:r>
+    </w:p>
+    <w:p>
+      <w:r>
+        <w:t xml:space="preserve">  16 | 2 | payload_len | number of payload bytes</w:t>
+      </w:r>
+    </w:p>
+    <w:p>
+      <w:r>
+        <w:t xml:space="preserve">  18 | 4 | payload_crc32 | CRC32(IEEE reflected) over payload only</w:t>
+      </w:r>
+    </w:p>
+    <w:p>
+      <w:r>
+        <w:t xml:space="preserve">  22 | N | payload | message body bytes</w:t>
+      </w:r>
+    </w:p>
+    <w:p>
+      <w:r>
+        <w:t xml:space="preserve">Validation Rule: reject frame if SOF mismatch, unsupported major version, length mismatch, or payload CRC mismatch.</w:t>
+      </w:r>
+    </w:p>
+    <w:p/>
+    <w:p>
+      <w:r>
+        <w:t xml:space="preserve">14.4 Message Families</w:t>
+      </w:r>
+    </w:p>
+    <w:p>
+      <w:r>
+        <w:t xml:space="preserve">Control Plane:</w:t>
+      </w:r>
+    </w:p>
+    <w:p>
+      <w:r>
+        <w:t xml:space="preserve">  - HELLO (0x0001): peer advertises version window, capabilities, and schema hash set</w:t>
+      </w:r>
+    </w:p>
+    <w:p>
+      <w:r>
+        <w:t xml:space="preserve">  - HELLO_ACK (0x0002): server decision (accept/reject), selected protocol version, selected schema hash</w:t>
+      </w:r>
+    </w:p>
+    <w:p>
+      <w:r>
+        <w:t xml:space="preserve">  - NACK (0x0003): structured rejection for invalid or incompatible handshake inputs</w:t>
+      </w:r>
+    </w:p>
+    <w:p>
+      <w:r>
+        <w:t xml:space="preserve">  - SCHEMA_GET (0x0010): peer requests descriptor for unknown selected schema hash</w:t>
+      </w:r>
+    </w:p>
+    <w:p>
+      <w:r>
+        <w:t xml:space="preserve">  - SCHEMA_CHUNK (0x0011): chunked descriptor transfer</w:t>
+      </w:r>
+    </w:p>
+    <w:p>
+      <w:r>
+        <w:t xml:space="preserve">  - PING (0x0020) / PONG (0x0021): liveness and RTT measurement</w:t>
+      </w:r>
+    </w:p>
+    <w:p>
+      <w:r>
+        <w:t xml:space="preserve">Data Plane:</w:t>
+      </w:r>
+    </w:p>
+    <w:p>
+      <w:r>
+        <w:t xml:space="preserve">  - SYSTEM_STATE (0x0100)</w:t>
+      </w:r>
+    </w:p>
+    <w:p>
+      <w:r>
+        <w:t xml:space="preserve">  - SENSOR_SNAPSHOT (0x0101)</w:t>
+      </w:r>
+    </w:p>
+    <w:p>
+      <w:r>
+        <w:t xml:space="preserve">  - SHOT_SNAPSHOT (0x0102)</w:t>
+      </w:r>
+    </w:p>
+    <w:p>
+      <w:r>
+        <w:t xml:space="preserve">  - PROFILE_GET/SET/DATA (0x0200/0x0201/0x0202)</w:t>
+      </w:r>
+    </w:p>
+    <w:p>
+      <w:r>
+        <w:t xml:space="preserve">  - SETTINGS_GET/SET/DATA (0x0210/0x0211/0x0212)</w:t>
+      </w:r>
+    </w:p>
+    <w:p>
+      <w:r>
+        <w:t xml:space="preserve">  - EVENT_RAISED (0x0300)</w:t>
+      </w:r>
+    </w:p>
+    <w:p>
+      <w:r>
+        <w:t xml:space="preserve">  - COMMAND_APPLY (0x0301)</w:t>
+      </w:r>
+    </w:p>
+    <w:p/>
+    <w:p>
+      <w:r>
+        <w:t xml:space="preserve">14.5 Capability and Schema Negotiation</w:t>
+      </w:r>
+    </w:p>
+    <w:p>
+      <w:r>
+        <w:t xml:space="preserve">HELLO fields:</w:t>
+      </w:r>
+    </w:p>
+    <w:p>
+      <w:r>
+        <w:t xml:space="preserve">  - max_frame_size</w:t>
+      </w:r>
+    </w:p>
+    <w:p>
+      <w:r>
+        <w:t xml:space="preserve">  - heartbeat_ms</w:t>
+      </w:r>
+    </w:p>
+    <w:p>
+      <w:r>
+        <w:t xml:space="preserve">  - build_id</w:t>
+      </w:r>
+    </w:p>
+    <w:p>
+      <w:r>
+        <w:t xml:space="preserve">  - capability_bits</w:t>
+      </w:r>
+    </w:p>
+    <w:p>
+      <w:r>
+        <w:t xml:space="preserve">  - supported_major_min</w:t>
+      </w:r>
+    </w:p>
+    <w:p>
+      <w:r>
+        <w:t xml:space="preserve">  - supported_major_max</w:t>
+      </w:r>
+    </w:p>
+    <w:p>
+      <w:r>
+        <w:t xml:space="preserve">  - schema_hash_count + schema_hashes[]</w:t>
+      </w:r>
+    </w:p>
+    <w:p>
+      <w:r>
+        <w:t xml:space="preserve">HELLO_ACK fields:</w:t>
+      </w:r>
+    </w:p>
+    <w:p>
+      <w:r>
+        <w:t xml:space="preserve">  - accepted (0 or 1)</w:t>
+      </w:r>
+    </w:p>
+    <w:p>
+      <w:r>
+        <w:t xml:space="preserve">  - selected_major and selected_minor</w:t>
+      </w:r>
+    </w:p>
+    <w:p>
+      <w:r>
+        <w:t xml:space="preserve">  - server_max_frame_size</w:t>
+      </w:r>
+    </w:p>
+    <w:p>
+      <w:r>
+        <w:t xml:space="preserve">  - heartbeat_ms</w:t>
+      </w:r>
+    </w:p>
+    <w:p>
+      <w:r>
+        <w:t xml:space="preserve">  - server_build_id</w:t>
+      </w:r>
+    </w:p>
+    <w:p>
+      <w:r>
+        <w:t xml:space="preserve">  - capability_bits</w:t>
+      </w:r>
+    </w:p>
+    <w:p>
+      <w:r>
+        <w:t xml:space="preserve">  - selected_schema_hash</w:t>
+      </w:r>
+    </w:p>
+    <w:p>
+      <w:r>
+        <w:t xml:space="preserve">Selection rule: choose first common schema hash according to server preference order. If none exists, return reject with no-common-schema reason.</w:t>
+      </w:r>
+    </w:p>
+    <w:p/>
+    <w:p>
+      <w:r>
+        <w:t xml:space="preserve">14.6 Compatibility Contract</w:t>
+      </w:r>
+    </w:p>
+    <w:p>
+      <w:r>
+        <w:t xml:space="preserve">Major Version Rule: mismatch is hard-fail at handshake.</w:t>
+      </w:r>
+    </w:p>
+    <w:p>
+      <w:r>
+        <w:t xml:space="preserve">Minor Version Rule: same major allows forward-compatible operation subject to capability checks.</w:t>
+      </w:r>
+    </w:p>
+    <w:p>
+      <w:r>
+        <w:t xml:space="preserve">Schema Rule: runtime data messages are valid only after schema hash selection succeeds.</w:t>
+      </w:r>
+    </w:p>
+    <w:p>
+      <w:r>
+        <w:t xml:space="preserve">Field Evolution Rule (best-practice alignment):</w:t>
+      </w:r>
+    </w:p>
+    <w:p>
+      <w:r>
+        <w:t xml:space="preserve">  - add new fields as optional/additive only</w:t>
+      </w:r>
+    </w:p>
+    <w:p>
+      <w:r>
+        <w:t xml:space="preserve">  - never change meaning of existing field identifiers</w:t>
+      </w:r>
+    </w:p>
+    <w:p>
+      <w:r>
+        <w:t xml:space="preserve">  - never reuse retired field identifiers</w:t>
+      </w:r>
+    </w:p>
+    <w:p>
+      <w:r>
+        <w:t xml:space="preserve">  - ignore unknown optional fields safely</w:t>
+      </w:r>
+    </w:p>
+    <w:p/>
+    <w:p>
+      <w:r>
+        <w:t xml:space="preserve">14.7 Sequence Diagram A - Nominal Handshake (Known Schema)</w:t>
+      </w:r>
+    </w:p>
+    <w:p>
+      <w:r>
+        <w:t xml:space="preserve">Figure 14-A:</w:t>
+      </w:r>
+    </w:p>
+    <w:p>
+      <w:r>
+        <w:t xml:space="preserve">  Peer A (Client/UI)            Peer B (Controller/Bridge)</w:t>
+      </w:r>
+    </w:p>
+    <w:p>
+      <w:r>
+        <w:t xml:space="preserve">        |                                   |</w:t>
+      </w:r>
+    </w:p>
+    <w:p>
+      <w:r>
+        <w:t xml:space="preserve">        | HELLO(ver range, caps, hashes)    |</w:t>
+      </w:r>
+    </w:p>
+    <w:p>
+      <w:r>
+        <w:t xml:space="preserve">        |----------------------------------&gt;|</w:t>
+      </w:r>
+    </w:p>
+    <w:p>
+      <w:r>
+        <w:t xml:space="preserve">        |                                   | validate + select schema</w:t>
+      </w:r>
+    </w:p>
+    <w:p>
+      <w:r>
+        <w:t xml:space="preserve">        | HELLO_ACK(accepted=1, schema=X)   |</w:t>
+      </w:r>
+    </w:p>
+    <w:p>
+      <w:r>
+        <w:t xml:space="preserve">        |&lt;----------------------------------|</w:t>
+      </w:r>
+    </w:p>
+    <w:p>
+      <w:r>
+        <w:t xml:space="preserve">        | SETTINGS_GET / PROFILE_GET / ...  |</w:t>
+      </w:r>
+    </w:p>
+    <w:p>
+      <w:r>
+        <w:t xml:space="preserve">        |----------------------------------&gt;|</w:t>
+      </w:r>
+    </w:p>
+    <w:p>
+      <w:r>
+        <w:t xml:space="preserve">        | SETTINGS_DATA / PROFILE_DATA /... |</w:t>
+      </w:r>
+    </w:p>
+    <w:p>
+      <w:r>
+        <w:t xml:space="preserve">        |&lt;----------------------------------|</w:t>
+      </w:r>
+    </w:p>
+    <w:p>
+      <w:r>
+        <w:t xml:space="preserve">        | PING                              |</w:t>
+      </w:r>
+    </w:p>
+    <w:p>
+      <w:r>
+        <w:t xml:space="preserve">        |----------------------------------&gt;|</w:t>
+      </w:r>
+    </w:p>
+    <w:p>
+      <w:r>
+        <w:t xml:space="preserve">        | PONG                              |</w:t>
+      </w:r>
+    </w:p>
+    <w:p>
+      <w:r>
+        <w:t xml:space="preserve">        |&lt;----------------------------------|</w:t>
+      </w:r>
+    </w:p>
+    <w:p/>
+    <w:p>
+      <w:r>
+        <w:t xml:space="preserve">14.8 Sequence Diagram B - Unknown Schema Then Descriptor Fetch</w:t>
+      </w:r>
+    </w:p>
+    <w:p>
+      <w:r>
+        <w:t xml:space="preserve">Figure 14-B:</w:t>
+      </w:r>
+    </w:p>
+    <w:p>
+      <w:r>
+        <w:t xml:space="preserve">  Peer A (Client/UI)            Peer B (Controller/Bridge)</w:t>
+      </w:r>
+    </w:p>
+    <w:p>
+      <w:r>
+        <w:t xml:space="preserve">        |                                   |</w:t>
+      </w:r>
+    </w:p>
+    <w:p>
+      <w:r>
+        <w:t xml:space="preserve">        | HELLO(hashes do not include server preferred hash)</w:t>
+      </w:r>
+    </w:p>
+    <w:p>
+      <w:r>
+        <w:t xml:space="preserve">        |----------------------------------&gt;|</w:t>
+      </w:r>
+    </w:p>
+    <w:p>
+      <w:r>
+        <w:t xml:space="preserve">        | HELLO_ACK(accepted=1, schema=Y)   |</w:t>
+      </w:r>
+    </w:p>
+    <w:p>
+      <w:r>
+        <w:t xml:space="preserve">        |&lt;----------------------------------|</w:t>
+      </w:r>
+    </w:p>
+    <w:p>
+      <w:r>
+        <w:t xml:space="preserve">        | SCHEMA_GET(schema=Y)              |</w:t>
+      </w:r>
+    </w:p>
+    <w:p>
+      <w:r>
+        <w:t xml:space="preserve">        |----------------------------------&gt;|</w:t>
+      </w:r>
+    </w:p>
+    <w:p>
+      <w:r>
+        <w:t xml:space="preserve">        | SCHEMA_CHUNK(1/N)                 |</w:t>
+      </w:r>
+    </w:p>
+    <w:p>
+      <w:r>
+        <w:t xml:space="preserve">        |&lt;----------------------------------|</w:t>
+      </w:r>
+    </w:p>
+    <w:p>
+      <w:r>
+        <w:t xml:space="preserve">        | ...                               |</w:t>
+      </w:r>
+    </w:p>
+    <w:p>
+      <w:r>
+        <w:t xml:space="preserve">        | SCHEMA_CHUNK(N/N)                 |</w:t>
+      </w:r>
+    </w:p>
+    <w:p>
+      <w:r>
+        <w:t xml:space="preserve">        |&lt;----------------------------------|</w:t>
+      </w:r>
+    </w:p>
+    <w:p>
+      <w:r>
+        <w:t xml:space="preserve">        | cache descriptor, activate parser |</w:t>
+      </w:r>
+    </w:p>
+    <w:p>
+      <w:r>
+        <w:t xml:space="preserve">        | normal data-plane traffic starts  |</w:t>
+      </w:r>
+    </w:p>
+    <w:p/>
+    <w:p>
+      <w:r>
+        <w:t xml:space="preserve">14.9 Sequence Diagram C - Reject Path (No Common Major Version)</w:t>
+      </w:r>
+    </w:p>
+    <w:p>
+      <w:r>
+        <w:t xml:space="preserve">Figure 14-C:</w:t>
+      </w:r>
+    </w:p>
+    <w:p>
+      <w:r>
+        <w:t xml:space="preserve">  Peer A                             Peer B</w:t>
+      </w:r>
+    </w:p>
+    <w:p>
+      <w:r>
+        <w:t xml:space="preserve">    | HELLO(major range excludes server major) |</w:t>
+      </w:r>
+    </w:p>
+    <w:p>
+      <w:r>
+        <w:t xml:space="preserve">    |------------------------------------------&gt;|</w:t>
+      </w:r>
+    </w:p>
+    <w:p>
+      <w:r>
+        <w:t xml:space="preserve">    | HELLO_ACK(accepted=0) or NACK            |</w:t>
+      </w:r>
+    </w:p>
+    <w:p>
+      <w:r>
+        <w:t xml:space="preserve">    |&lt;------------------------------------------|</w:t>
+      </w:r>
+    </w:p>
+    <w:p>
+      <w:r>
+        <w:t xml:space="preserve">    | enter error/recovery path                 |</w:t>
+      </w:r>
+    </w:p>
+    <w:p>
+      <w:r>
+        <w:t xml:space="preserve">    | do not send data-plane messages           |</w:t>
+      </w:r>
+    </w:p>
+    <w:p/>
+    <w:p>
+      <w:r>
+        <w:t xml:space="preserve">14.10 Handshake Examples (Concrete Values)</w:t>
+      </w:r>
+    </w:p>
+    <w:p>
+      <w:r>
+        <w:t xml:space="preserve">Example 1 - HELLO (decoded view):</w:t>
+      </w:r>
+    </w:p>
+    <w:p>
+      <w:r>
+        <w:t xml:space="preserve">  major=1 minor=0 msg_id=0x0001 session_id=0 seq=1</w:t>
+      </w:r>
+    </w:p>
+    <w:p>
+      <w:r>
+        <w:t xml:space="preserve">  payload.max_frame_size=2300</w:t>
+      </w:r>
+    </w:p>
+    <w:p>
+      <w:r>
+        <w:t xml:space="preserve">  payload.heartbeat_ms=300</w:t>
+      </w:r>
+    </w:p>
+    <w:p>
+      <w:r>
+        <w:t xml:space="preserve">  payload.capability_bits=0x000000000000000F</w:t>
+      </w:r>
+    </w:p>
+    <w:p>
+      <w:r>
+        <w:t xml:space="preserve">  payload.supported_major_min=1</w:t>
+      </w:r>
+    </w:p>
+    <w:p>
+      <w:r>
+        <w:t xml:space="preserve">  payload.supported_major_max=1</w:t>
+      </w:r>
+    </w:p>
+    <w:p>
+      <w:r>
+        <w:t xml:space="preserve">  payload.schema_hashes=[0x9B9F1264A2F0CC11, 0x8C2E3A71D55B44F0]</w:t>
+      </w:r>
+    </w:p>
+    <w:p>
+      <w:r>
+        <w:t xml:space="preserve">Example 2 - HELLO_ACK accept:</w:t>
+      </w:r>
+    </w:p>
+    <w:p>
+      <w:r>
+        <w:t xml:space="preserve">  msg_id=0x0002 flags=is_response accepted=1</w:t>
+      </w:r>
+    </w:p>
+    <w:p>
+      <w:r>
+        <w:t xml:space="preserve">  selected_major=1 selected_minor=0</w:t>
+      </w:r>
+    </w:p>
+    <w:p>
+      <w:r>
+        <w:t xml:space="preserve">  selected_schema_hash=0x9B9F1264A2F0CC11</w:t>
+      </w:r>
+    </w:p>
+    <w:p>
+      <w:r>
+        <w:t xml:space="preserve">Example 3 - Reject:</w:t>
+      </w:r>
+    </w:p>
+    <w:p>
+      <w:r>
+        <w:t xml:space="preserve">  msg_id=0x0003 flags=is_error</w:t>
+      </w:r>
+    </w:p>
+    <w:p>
+      <w:r>
+        <w:t xml:space="preserve">  reason=no_common_schema or unsupported_major_version</w:t>
+      </w:r>
+    </w:p>
+    <w:p/>
+    <w:p>
+      <w:r>
+        <w:t xml:space="preserve">14.11 Error Handling and Recovery Rules</w:t>
+      </w:r>
+    </w:p>
+    <w:p>
+      <w:r>
+        <w:t xml:space="preserve">Frame Error Rule: malformed frame increments transport error counter and may trigger session reset after threshold.</w:t>
+      </w:r>
+    </w:p>
+    <w:p>
+      <w:r>
+        <w:t xml:space="preserve">Negotiation Error Rule: rejected HELLO does not consume or alter active session counters.</w:t>
+      </w:r>
+    </w:p>
+    <w:p>
+      <w:r>
+        <w:t xml:space="preserve">Runtime Parse Error Rule: payload parse failures are isolated to the message; repeated parse failures trigger link health downgrade.</w:t>
+      </w:r>
+    </w:p>
+    <w:p>
+      <w:r>
+        <w:t xml:space="preserve">Timeout Rule: missing PONG or keepalive response beyond watchdog window triggers reconnect workflow.</w:t>
+      </w:r>
+    </w:p>
+    <w:p/>
+    <w:p>
+      <w:r>
+        <w:t xml:space="preserve">14.12 Security and Robustness Baseline</w:t>
+      </w:r>
+    </w:p>
+    <w:p>
+      <w:r>
+        <w:t xml:space="preserve">Integrity: payload CRC32 is mandatory for every frame.</w:t>
+      </w:r>
+    </w:p>
+    <w:p>
+      <w:r>
+        <w:t xml:space="preserve">Replay/Mixup Guard: session_id plus monotonic seq prevents stale-frame acceptance after reconnect.</w:t>
+      </w:r>
+    </w:p>
+    <w:p>
+      <w:r>
+        <w:t xml:space="preserve">Downgrade Guard: selected major/minor and schema hash are explicit in HELLO_ACK and must be checked before state acceptance.</w:t>
+      </w:r>
+    </w:p>
+    <w:p>
+      <w:r>
+        <w:t xml:space="preserve">Input Hardening: unknown msg_id without negotiation support returns NACK and is never treated as application data.</w:t>
+      </w:r>
+    </w:p>
+    <w:p/>
+    <w:p>
+      <w:r>
+        <w:t xml:space="preserve">14.13 Implementation Mapping in This Repository</w:t>
+      </w:r>
+    </w:p>
+    <w:p>
+      <w:r>
+        <w:t xml:space="preserve">Wire schema API: firmware/esp32c3_bridge/main/ProtocolLCD_Controller.h</w:t>
+      </w:r>
+    </w:p>
+    <w:p>
+      <w:r>
+        <w:t xml:space="preserve">Wire codec and negotiation helpers: firmware/esp32c3_bridge/main/ProtocolLCD_Controller.c</w:t>
+      </w:r>
+    </w:p>
+    <w:p>
+      <w:r>
+        <w:t xml:space="preserve">State contract model: firmware/esp32c3_bridge/main/SystemStatesLCD_Controller.h</w:t>
+      </w:r>
+    </w:p>
+    <w:p>
+      <w:r>
+        <w:t xml:space="preserve">Profile/settings data contract: firmware/esp32c3_bridge/main/DataStructuresLCD_Controller.h</w:t>
+      </w:r>
+    </w:p>
+    <w:p>
+      <w:r>
+        <w:t xml:space="preserve">Integration status: phase-1 codec and negotiation helpers are implemented; runtime bridge handshake routing is the next phase.</w:t>
+      </w:r>
+    </w:p>
+    <w:p/>
+    <w:p>
+      <w:r>
+        <w:t xml:space="preserve">14.14 Acceptance Checklist for Protocol Integration</w:t>
+      </w:r>
+    </w:p>
+    <w:p>
+      <w:r>
+        <w:t xml:space="preserve">  - HELLO and HELLO_ACK roundtrip passes with matching schema hash</w:t>
+      </w:r>
+    </w:p>
+    <w:p>
+      <w:r>
+        <w:t xml:space="preserve">  - reject path verified for unsupported major version</w:t>
+      </w:r>
+    </w:p>
+    <w:p>
+      <w:r>
+        <w:t xml:space="preserve">  - reject path verified for empty schema intersection</w:t>
+      </w:r>
+    </w:p>
+    <w:p>
+      <w:r>
+        <w:t xml:space="preserve">  - CRC mismatch causes deterministic frame rejection</w:t>
+      </w:r>
+    </w:p>
+    <w:p>
+      <w:r>
+        <w:t xml:space="preserve">  - unknown optional field does not break parser</w:t>
+      </w:r>
+    </w:p>
+    <w:p>
+      <w:r>
+        <w:t xml:space="preserve">  - PING/PONG RTT path produces bounded latency samples</w:t>
+      </w:r>
+    </w:p>
+    <w:p>
+      <w:r>
+        <w:t xml:space="preserve">  - reconnect establishes a new session_id and resets sequence origin</w:t>
+      </w:r>
+    </w:p>
+    <w:p/>
+    <w:p>
+      <w:r>
+        <w:t xml:space="preserve">14.15 External Reference URLs</w:t>
+      </w:r>
+    </w:p>
+    <w:p>
+      <w:r>
+        <w:t xml:space="preserve">  - TCP transport-state reference (RFC 9293): https://www.rfc-editor.org/rfc/rfc9293</w:t>
+      </w:r>
+    </w:p>
+    <w:p>
+      <w:r>
+        <w:t xml:space="preserve">  - QUIC version-negotiation reference (RFC 9000): https://www.rfc-editor.org/rfc/rfc9000</w:t>
+      </w:r>
+    </w:p>
+    <w:p>
+      <w:r>
+        <w:t xml:space="preserve">  - gRPC wire protocol reference (HTTP/2 mapping): https://github.com/grpc/grpc/blob/master/doc/PROTOCOL-HTTP2.md</w:t>
+      </w:r>
+    </w:p>
+    <w:p>
+      <w:r>
+        <w:t xml:space="preserve">  - Protocol Buffers compatibility guidance: https://protobuf.dev/programming-guides/proto3/#updating</w:t>
       </w:r>
     </w:p>
     <w:sectPr>

</xml_diff>